<commit_message>
docs: rewrite Word guide based on latest business logic - 6 sections, parameter tables, FAQ, no legacy version references
</commit_message>
<xml_diff>
--- a/分仓占比计算引擎_使用说明.docx
+++ b/分仓占比计算引擎_使用说明.docx
@@ -4,10 +4,138 @@
   <w:body>
     <w:p>
       <w:pPr>
-        <w:pStyle w:val="Title"/>
+        <w:jc w:val="center"/>
       </w:pPr>
       <w:r>
-        <w:t>分仓占比计算引擎 - 使用说明</w:t>
+        <w:rPr>
+          <w:b/>
+          <w:color w:val="1A5CB0"/>
+          <w:sz w:val="44"/>
+        </w:rPr>
+        <w:t>分仓占比计算引擎</w:t>
+      </w:r>
+    </w:p>
+    <w:p>
+      <w:pPr>
+        <w:jc w:val="center"/>
+      </w:pPr>
+      <w:r>
+        <w:rPr>
+          <w:color w:val="555555"/>
+          <w:sz w:val="28"/>
+        </w:rPr>
+        <w:t>使用说明</w:t>
+      </w:r>
+    </w:p>
+    <w:p>
+      <w:pPr>
+        <w:jc w:val="center"/>
+      </w:pPr>
+      <w:r>
+        <w:rPr>
+          <w:color w:val="888888"/>
+          <w:sz w:val="20"/>
+        </w:rPr>
+        <w:t>上传历史出单数据 → 调节参数 → 计算各仓库发货占比 → 导出结果</w:t>
+      </w:r>
+    </w:p>
+    <w:p>
+      <w:pPr>
+        <w:jc w:val="center"/>
+      </w:pPr>
+      <w:r>
+        <w:rPr>
+          <w:color w:val="888888"/>
+          <w:sz w:val="20"/>
+        </w:rPr>
+        <w:t>四仓占比合计恒为 100%  |  最大余额法保证落货量整数精确  |  自动体检防静默失效</w:t>
+      </w:r>
+    </w:p>
+    <w:p>
+      <w:pPr>
+        <w:jc w:val="right"/>
+      </w:pPr>
+      <w:r>
+        <w:rPr>
+          <w:color w:val="999999"/>
+          <w:sz w:val="18"/>
+        </w:rPr>
+        <w:t>自动生成 | 随代码同步更新</w:t>
+      </w:r>
+    </w:p>
+    <w:p/>
+    <w:p>
+      <w:pPr>
+        <w:pStyle w:val="Heading1"/>
+      </w:pPr>
+      <w:r>
+        <w:t>1. 系统概述</w:t>
+      </w:r>
+    </w:p>
+    <w:p>
+      <w:r>
+        <w:t>分仓占比计算引擎是一款面向跨境电商运营人员的工具，用于计算各 SKU 在四个仓库（美西、美东、美南GA、美南TX）的发货占比。</w:t>
+      </w:r>
+    </w:p>
+    <w:p>
+      <w:r>
+        <w:t>核心能力：</w:t>
+      </w:r>
+    </w:p>
+    <w:p>
+      <w:pPr>
+        <w:pStyle w:val="ListBullet"/>
+      </w:pPr>
+      <w:r>
+        <w:t>基于历史出单数据计算各 SKU 的分仓占比，支持多年份数据</w:t>
+      </w:r>
+    </w:p>
+    <w:p>
+      <w:pPr>
+        <w:pStyle w:val="ListBullet"/>
+      </w:pPr>
+      <w:r>
+        <w:t>时间衰减加权 + 季节匹配因子 + 趋势因子三层加权体系</w:t>
+      </w:r>
+    </w:p>
+    <w:p>
+      <w:pPr>
+        <w:pStyle w:val="ListBullet"/>
+      </w:pPr>
+      <w:r>
+        <w:t>基准占比层级回退：SPU → 一级分类 → 室内外 → 全公司，每层贝叶斯收缩</w:t>
+      </w:r>
+    </w:p>
+    <w:p>
+      <w:pPr>
+        <w:pStyle w:val="ListBullet"/>
+      </w:pPr>
+      <w:r>
+        <w:t>减仓优化：月均&lt;3单且占比&lt;5%的仓位自动减仓，占比等比分配到其他仓</w:t>
+      </w:r>
+    </w:p>
+    <w:p>
+      <w:pPr>
+        <w:pStyle w:val="ListBullet"/>
+      </w:pPr>
+      <w:r>
+        <w:t>四仓占比合计恒为 100%，落货量最大余额法保证整数精确</w:t>
+      </w:r>
+    </w:p>
+    <w:p>
+      <w:pPr>
+        <w:pStyle w:val="ListBullet"/>
+      </w:pPr>
+      <w:r>
+        <w:t>占比微调：拖动滑块调整四仓占比，自动补足到 100%</w:t>
+      </w:r>
+    </w:p>
+    <w:p>
+      <w:pPr>
+        <w:pStyle w:val="ListBullet"/>
+      </w:pPr>
+      <w:r>
+        <w:t>多维度导出：Excel（含聚合）、CSV（SKU级/一级分类）</w:t>
       </w:r>
     </w:p>
     <w:p>
@@ -15,7 +143,173 @@
         <w:pStyle w:val="Heading1"/>
       </w:pPr>
       <w:r>
-        <w:t>计算链路（7步）</w:t>
+        <w:t>2. 页面结构总览</w:t>
+      </w:r>
+    </w:p>
+    <w:p>
+      <w:r>
+        <w:t>页面分为侧边栏（参数面板）和主区域（操作区）两部分。</w:t>
+      </w:r>
+    </w:p>
+    <w:p>
+      <w:pPr>
+        <w:pStyle w:val="Heading2"/>
+      </w:pPr>
+      <w:r>
+        <w:t>侧边栏 — 参数面板</w:t>
+      </w:r>
+    </w:p>
+    <w:p>
+      <w:r>
+        <w:t>分为五个参数分组，从上到下依次为：</w:t>
+      </w:r>
+    </w:p>
+    <w:p>
+      <w:pPr>
+        <w:pStyle w:val="ListBullet"/>
+      </w:pPr>
+      <w:r>
+        <w:t>① 目标发货月份：选择起始年月和结束年月（如 2026年12月 → 2027年3月）</w:t>
+      </w:r>
+    </w:p>
+    <w:p>
+      <w:pPr>
+        <w:pStyle w:val="ListBullet"/>
+      </w:pPr>
+      <w:r>
+        <w:t>② 时间衰减加权：同月跨年衰减率 λ_same、非同月衰减率 λ</w:t>
+      </w:r>
+    </w:p>
+    <w:p>
+      <w:pPr>
+        <w:pStyle w:val="ListBullet"/>
+      </w:pPr>
+      <w:r>
+        <w:t>③ 季节匹配因子：强季节 λ、弱季节 λ_weak、窗口范围 N、适用品类（默认折叠）</w:t>
+      </w:r>
+    </w:p>
+    <w:p>
+      <w:pPr>
+        <w:pStyle w:val="ListBullet"/>
+      </w:pPr>
+      <w:r>
+        <w:t>④ 趋势因子 α：趋势因子 α、单仓调整上限、归一化方式（默认折叠）</w:t>
+      </w:r>
+    </w:p>
+    <w:p>
+      <w:pPr>
+        <w:pStyle w:val="ListBullet"/>
+      </w:pPr>
+      <w:r>
+        <w:t>⑤ 新品与基准：新品阈值、新品订单量门槛、收缩强度 k、权重上/下限、品类层观测数（默认折叠）</w:t>
+      </w:r>
+    </w:p>
+    <w:p>
+      <w:pPr>
+        <w:pStyle w:val="Heading2"/>
+      </w:pPr>
+      <w:r>
+        <w:t>主区域 — 操作区</w:t>
+      </w:r>
+    </w:p>
+    <w:p>
+      <w:r>
+        <w:t>分为六个区块，从上到下依次为：</w:t>
+      </w:r>
+    </w:p>
+    <w:p>
+      <w:pPr>
+        <w:pStyle w:val="ListBullet"/>
+      </w:pPr>
+      <w:r>
+        <w:t>1. 上传数据：上传原始出单数据（CSV/Excel）或使用示例数据</w:t>
+      </w:r>
+    </w:p>
+    <w:p>
+      <w:pPr>
+        <w:pStyle w:val="ListBullet"/>
+      </w:pPr>
+      <w:r>
+        <w:t>2. 开始计算：蓝色边框容器内含季节适用品类多选、减仓优化开关、计算按钮</w:t>
+      </w:r>
+    </w:p>
+    <w:p>
+      <w:pPr>
+        <w:pStyle w:val="ListBullet"/>
+      </w:pPr>
+      <w:r>
+        <w:t>3. 计算结果：自动体检、KPI卡片（四仓平均占比）、SKU级表格（分页Tab）、聚合层级占比</w:t>
+      </w:r>
+    </w:p>
+    <w:p>
+      <w:pPr>
+        <w:pStyle w:val="ListBullet"/>
+      </w:pPr>
+      <w:r>
+        <w:t>4. 占比微调：滑块调整四仓占比，自动补足到 100%，生成落货量</w:t>
+      </w:r>
+    </w:p>
+    <w:p>
+      <w:pPr>
+        <w:pStyle w:val="ListBullet"/>
+      </w:pPr>
+      <w:r>
+        <w:t>5. 可视化：饼图、可搜索堆叠图</w:t>
+      </w:r>
+    </w:p>
+    <w:p>
+      <w:pPr>
+        <w:pStyle w:val="ListBullet"/>
+      </w:pPr>
+      <w:r>
+        <w:t>6. 导出结果：Excel（含聚合）、CSV（SKU级）、CSV（一级分类）</w:t>
+      </w:r>
+    </w:p>
+    <w:p>
+      <w:pPr>
+        <w:pStyle w:val="ListBullet"/>
+      </w:pPr>
+      <w:r>
+        <w:t>右上角：下载说明按钮（Markdown 版本）</w:t>
+      </w:r>
+    </w:p>
+    <w:p>
+      <w:pPr>
+        <w:pStyle w:val="Heading1"/>
+      </w:pPr>
+      <w:r>
+        <w:t>3. 侧边栏参数说明</w:t>
+      </w:r>
+    </w:p>
+    <w:p>
+      <w:pPr>
+        <w:pStyle w:val="Heading2"/>
+      </w:pPr>
+      <w:r>
+        <w:t>3.1 目标发货月份</w:t>
+      </w:r>
+    </w:p>
+    <w:p>
+      <w:r>
+        <w:t>选择起始年月和结束年月，每个下拉框直接显示「2027年1月」这样的年月组合。支持跨年（如 2026年12月 → 2027年3月）。</w:t>
+      </w:r>
+    </w:p>
+    <w:p>
+      <w:r>
+        <w:t>锚点 = 目标期中间月份。强季节品类只看目标期同月数据，弱季节品类放开全部月份。</w:t>
+      </w:r>
+    </w:p>
+    <w:p>
+      <w:pPr>
+        <w:pStyle w:val="Heading2"/>
+      </w:pPr>
+      <w:r>
+        <w:t>3.2 时间衰减加权</w:t>
+      </w:r>
+    </w:p>
+    <w:p>
+      <w:r>
+        <w:t>控制历史数据的影响力。同月数据跨年衰减用 λ_same，非同月数据用 λ。</w:t>
       </w:r>
     </w:p>
     <w:tbl>
@@ -39,7 +333,7 @@
               <w:rPr>
                 <w:b/>
               </w:rPr>
-              <w:t>步骤</w:t>
+              <w:t>参数</w:t>
             </w:r>
           </w:p>
         </w:tc>
@@ -52,313 +346,13 @@
               <w:rPr>
                 <w:b/>
               </w:rPr>
-              <w:t>做什么</w:t>
+              <w:t>默认值</w:t>
             </w:r>
           </w:p>
         </w:tc>
         <w:tc>
           <w:tcPr>
             <w:tcW w:type="dxa" w:w="2880"/>
-          </w:tcPr>
-          <w:p>
-            <w:r>
-              <w:rPr>
-                <w:b/>
-              </w:rPr>
-              <w:t>关键参数</w:t>
-            </w:r>
-          </w:p>
-        </w:tc>
-      </w:tr>
-      <w:tr>
-        <w:tc>
-          <w:tcPr>
-            <w:tcW w:type="dxa" w:w="2880"/>
-          </w:tcPr>
-          <w:p>
-            <w:r>
-              <w:t>① 运算SKU映射</w:t>
-            </w:r>
-          </w:p>
-        </w:tc>
-        <w:tc>
-          <w:tcPr>
-            <w:tcW w:type="dxa" w:w="2880"/>
-          </w:tcPr>
-          <w:p>
-            <w:r>
-              <w:t>混用SKU映射表把源SKU合并到相似SKU；未映射的取「-」前部分</w:t>
-            </w:r>
-          </w:p>
-        </w:tc>
-        <w:tc>
-          <w:tcPr>
-            <w:tcW w:type="dxa" w:w="2880"/>
-          </w:tcPr>
-          <w:p>
-            <w:r>
-              <w:t>—</w:t>
-            </w:r>
-          </w:p>
-        </w:tc>
-      </w:tr>
-      <w:tr>
-        <w:tc>
-          <w:tcPr>
-            <w:tcW w:type="dxa" w:w="2880"/>
-          </w:tcPr>
-          <w:p>
-            <w:r>
-              <w:t>② 时间衰减加权</w:t>
-            </w:r>
-          </w:p>
-        </w:tc>
-        <w:tc>
-          <w:tcPr>
-            <w:tcW w:type="dxa" w:w="2880"/>
-          </w:tcPr>
-          <w:p>
-            <w:r>
-              <w:t>只对目标期月份赋权，权重 = λ^(锚点−月份)</w:t>
-            </w:r>
-          </w:p>
-        </w:tc>
-        <w:tc>
-          <w:tcPr>
-            <w:tcW w:type="dxa" w:w="2880"/>
-          </w:tcPr>
-          <w:p>
-            <w:r>
-              <w:t>λ</w:t>
-            </w:r>
-          </w:p>
-        </w:tc>
-      </w:tr>
-      <w:tr>
-        <w:tc>
-          <w:tcPr>
-            <w:tcW w:type="dxa" w:w="2880"/>
-          </w:tcPr>
-          <w:p>
-            <w:r>
-              <w:t>③ 季节匹配因子</w:t>
-            </w:r>
-          </w:p>
-        </w:tc>
-        <w:tc>
-          <w:tcPr>
-            <w:tcW w:type="dxa" w:w="2880"/>
-          </w:tcPr>
-          <w:p>
-            <w:r>
-              <w:t>目标月之前 N 个月的历史数据权重 × β（环形距离，目标月本身不计入）</w:t>
-            </w:r>
-          </w:p>
-        </w:tc>
-        <w:tc>
-          <w:tcPr>
-            <w:tcW w:type="dxa" w:w="2880"/>
-          </w:tcPr>
-          <w:p>
-            <w:r>
-              <w:t>β、N、适用品类</w:t>
-            </w:r>
-          </w:p>
-        </w:tc>
-      </w:tr>
-      <w:tr>
-        <w:tc>
-          <w:tcPr>
-            <w:tcW w:type="dxa" w:w="2880"/>
-          </w:tcPr>
-          <w:p>
-            <w:r>
-              <w:t>④ 自身占比</w:t>
-            </w:r>
-          </w:p>
-        </w:tc>
-        <w:tc>
-          <w:tcPr>
-            <w:tcW w:type="dxa" w:w="2880"/>
-          </w:tcPr>
-          <w:p>
-            <w:r>
-              <w:t>加权出单量 ÷ 加权合计，逐仓计算</w:t>
-            </w:r>
-          </w:p>
-        </w:tc>
-        <w:tc>
-          <w:tcPr>
-            <w:tcW w:type="dxa" w:w="2880"/>
-          </w:tcPr>
-          <w:p>
-            <w:r>
-              <w:t>—</w:t>
-            </w:r>
-          </w:p>
-        </w:tc>
-      </w:tr>
-      <w:tr>
-        <w:tc>
-          <w:tcPr>
-            <w:tcW w:type="dxa" w:w="2880"/>
-          </w:tcPr>
-          <w:p>
-            <w:r>
-              <w:t>⑤ 基准占比</w:t>
-            </w:r>
-          </w:p>
-        </w:tc>
-        <w:tc>
-          <w:tcPr>
-            <w:tcW w:type="dxa" w:w="2880"/>
-          </w:tcPr>
-          <w:p>
-            <w:r>
-              <w:t>层级回退 SPU→一级分类→室内外→全公司，每层做贝叶斯收缩</w:t>
-            </w:r>
-          </w:p>
-        </w:tc>
-        <w:tc>
-          <w:tcPr>
-            <w:tcW w:type="dxa" w:w="2880"/>
-          </w:tcPr>
-          <w:p>
-            <w:r>
-              <w:t>品类层最小等效观测数</w:t>
-            </w:r>
-          </w:p>
-        </w:tc>
-      </w:tr>
-      <w:tr>
-        <w:tc>
-          <w:tcPr>
-            <w:tcW w:type="dxa" w:w="2880"/>
-          </w:tcPr>
-          <w:p>
-            <w:r>
-              <w:t>⑥ 最终占比</w:t>
-            </w:r>
-          </w:p>
-        </w:tc>
-        <w:tc>
-          <w:tcPr>
-            <w:tcW w:type="dxa" w:w="2880"/>
-          </w:tcPr>
-          <w:p>
-            <w:r>
-              <w:t>自身与基准加权混合，再叠加趋势调整，最后归一化</w:t>
-            </w:r>
-          </w:p>
-        </w:tc>
-        <w:tc>
-          <w:tcPr>
-            <w:tcW w:type="dxa" w:w="2880"/>
-          </w:tcPr>
-          <w:p>
-            <w:r>
-              <w:t>k、权重上下限、α、调整上限</w:t>
-            </w:r>
-          </w:p>
-        </w:tc>
-      </w:tr>
-      <w:tr>
-        <w:tc>
-          <w:tcPr>
-            <w:tcW w:type="dxa" w:w="2880"/>
-          </w:tcPr>
-          <w:p>
-            <w:r>
-              <w:t>⑦ 落货量</w:t>
-            </w:r>
-          </w:p>
-        </w:tc>
-        <w:tc>
-          <w:tcPr>
-            <w:tcW w:type="dxa" w:w="2880"/>
-          </w:tcPr>
-          <w:p>
-            <w:r>
-              <w:t>占比 × 批量，最大余额法保证整数合计精确等于批量</w:t>
-            </w:r>
-          </w:p>
-        </w:tc>
-        <w:tc>
-          <w:tcPr>
-            <w:tcW w:type="dxa" w:w="2880"/>
-          </w:tcPr>
-          <w:p>
-            <w:r>
-              <w:t>—</w:t>
-            </w:r>
-          </w:p>
-        </w:tc>
-      </w:tr>
-    </w:tbl>
-    <w:p/>
-    <w:p>
-      <w:pPr>
-        <w:pStyle w:val="Heading1"/>
-      </w:pPr>
-      <w:r>
-        <w:t>参数生效层级一览</w:t>
-      </w:r>
-    </w:p>
-    <w:tbl>
-      <w:tblPr>
-        <w:tblStyle w:val="LightGrid-Accent1"/>
-        <w:tblW w:type="auto" w:w="0"/>
-        <w:tblLook w:firstColumn="1" w:firstRow="1" w:lastColumn="0" w:lastRow="0" w:noHBand="0" w:noVBand="1" w:val="04A0"/>
-      </w:tblPr>
-      <w:tblGrid>
-        <w:gridCol w:w="2160"/>
-        <w:gridCol w:w="2160"/>
-        <w:gridCol w:w="2160"/>
-        <w:gridCol w:w="2160"/>
-      </w:tblGrid>
-      <w:tr>
-        <w:tc>
-          <w:tcPr>
-            <w:tcW w:type="dxa" w:w="2160"/>
-          </w:tcPr>
-          <w:p>
-            <w:r>
-              <w:rPr>
-                <w:b/>
-              </w:rPr>
-              <w:t>参数</w:t>
-            </w:r>
-          </w:p>
-        </w:tc>
-        <w:tc>
-          <w:tcPr>
-            <w:tcW w:type="dxa" w:w="2160"/>
-          </w:tcPr>
-          <w:p>
-            <w:r>
-              <w:rPr>
-                <w:b/>
-              </w:rPr>
-              <w:t>作用层</w:t>
-            </w:r>
-          </w:p>
-        </w:tc>
-        <w:tc>
-          <w:tcPr>
-            <w:tcW w:type="dxa" w:w="2160"/>
-          </w:tcPr>
-          <w:p>
-            <w:r>
-              <w:rPr>
-                <w:b/>
-              </w:rPr>
-              <w:t>影响范围</w:t>
-            </w:r>
-          </w:p>
-        </w:tc>
-        <w:tc>
-          <w:tcPr>
-            <w:tcW w:type="dxa" w:w="2160"/>
           </w:tcPr>
           <w:p>
             <w:r>
@@ -373,41 +367,31 @@
       <w:tr>
         <w:tc>
           <w:tcPr>
-            <w:tcW w:type="dxa" w:w="2160"/>
+            <w:tcW w:type="dxa" w:w="2880"/>
           </w:tcPr>
           <w:p>
             <w:r>
-              <w:t>λ 衰减速度</w:t>
+              <w:t>同月跨年衰减率 λ_same</w:t>
             </w:r>
           </w:p>
         </w:tc>
         <w:tc>
           <w:tcPr>
-            <w:tcW w:type="dxa" w:w="2160"/>
+            <w:tcW w:type="dxa" w:w="2880"/>
           </w:tcPr>
           <w:p>
             <w:r>
-              <w:t>加权层（步骤②）</w:t>
+              <w:t>0.95</w:t>
             </w:r>
           </w:p>
         </w:tc>
         <w:tc>
           <w:tcPr>
-            <w:tcW w:type="dxa" w:w="2160"/>
+            <w:tcW w:type="dxa" w:w="2880"/>
           </w:tcPr>
           <w:p>
             <w:r>
-              <w:t>全局，所有品类</w:t>
-            </w:r>
-          </w:p>
-        </w:tc>
-        <w:tc>
-          <w:tcPr>
-            <w:tcW w:type="dxa" w:w="2160"/>
-          </w:tcPr>
-          <w:p>
-            <w:r>
-              <w:t>控制目标期内近期 vs 远期数据权重</w:t>
+              <w:t>同月数据跨年衰减。去年同月保留95%，前年同月保留90%</w:t>
             </w:r>
           </w:p>
         </w:tc>
@@ -415,167 +399,31 @@
       <w:tr>
         <w:tc>
           <w:tcPr>
-            <w:tcW w:type="dxa" w:w="2160"/>
+            <w:tcW w:type="dxa" w:w="2880"/>
           </w:tcPr>
           <w:p>
             <w:r>
-              <w:t>β 季节增强倍数</w:t>
+              <w:t>非同月衰减率 λ</w:t>
             </w:r>
           </w:p>
         </w:tc>
         <w:tc>
           <w:tcPr>
-            <w:tcW w:type="dxa" w:w="2160"/>
+            <w:tcW w:type="dxa" w:w="2880"/>
           </w:tcPr>
           <w:p>
             <w:r>
-              <w:t>加权层（步骤③）</w:t>
+              <w:t>0.85</w:t>
             </w:r>
           </w:p>
         </w:tc>
         <w:tc>
           <w:tcPr>
-            <w:tcW w:type="dxa" w:w="2160"/>
+            <w:tcW w:type="dxa" w:w="2880"/>
           </w:tcPr>
           <w:p>
             <w:r>
-              <w:t>仅适用品类</w:t>
-            </w:r>
-          </w:p>
-        </w:tc>
-        <w:tc>
-          <w:tcPr>
-            <w:tcW w:type="dxa" w:w="2160"/>
-          </w:tcPr>
-          <w:p>
-            <w:r>
-              <w:t>放大同季历史数据权重</w:t>
-            </w:r>
-          </w:p>
-        </w:tc>
-      </w:tr>
-      <w:tr>
-        <w:tc>
-          <w:tcPr>
-            <w:tcW w:type="dxa" w:w="2160"/>
-          </w:tcPr>
-          <w:p>
-            <w:r>
-              <w:t>α 趋势因子</w:t>
-            </w:r>
-          </w:p>
-        </w:tc>
-        <w:tc>
-          <w:tcPr>
-            <w:tcW w:type="dxa" w:w="2160"/>
-          </w:tcPr>
-          <w:p>
-            <w:r>
-              <w:t>最终占比层（步骤⑥）</w:t>
-            </w:r>
-          </w:p>
-        </w:tc>
-        <w:tc>
-          <w:tcPr>
-            <w:tcW w:type="dxa" w:w="2160"/>
-          </w:tcPr>
-          <w:p>
-            <w:r>
-              <w:t>全局，有趋势数据的SKU</w:t>
-            </w:r>
-          </w:p>
-        </w:tc>
-        <w:tc>
-          <w:tcPr>
-            <w:tcW w:type="dxa" w:w="2160"/>
-          </w:tcPr>
-          <w:p>
-            <w:r>
-              <w:t>叠加年度趋势差到最终占比</w:t>
-            </w:r>
-          </w:p>
-        </w:tc>
-      </w:tr>
-      <w:tr>
-        <w:tc>
-          <w:tcPr>
-            <w:tcW w:type="dxa" w:w="2160"/>
-          </w:tcPr>
-          <w:p>
-            <w:r>
-              <w:t>k 收缩强度</w:t>
-            </w:r>
-          </w:p>
-        </w:tc>
-        <w:tc>
-          <w:tcPr>
-            <w:tcW w:type="dxa" w:w="2160"/>
-          </w:tcPr>
-          <w:p>
-            <w:r>
-              <w:t>SKU层混合（步骤⑥）</w:t>
-            </w:r>
-          </w:p>
-        </w:tc>
-        <w:tc>
-          <w:tcPr>
-            <w:tcW w:type="dxa" w:w="2160"/>
-          </w:tcPr>
-          <w:p>
-            <w:r>
-              <w:t>全局</w:t>
-            </w:r>
-          </w:p>
-        </w:tc>
-        <w:tc>
-          <w:tcPr>
-            <w:tcW w:type="dxa" w:w="2160"/>
-          </w:tcPr>
-          <w:p>
-            <w:r>
-              <w:t>自身历史 vs 基准的混合比例</w:t>
-            </w:r>
-          </w:p>
-        </w:tc>
-      </w:tr>
-      <w:tr>
-        <w:tc>
-          <w:tcPr>
-            <w:tcW w:type="dxa" w:w="2160"/>
-          </w:tcPr>
-          <w:p>
-            <w:r>
-              <w:t>k_cat 品类层观测数</w:t>
-            </w:r>
-          </w:p>
-        </w:tc>
-        <w:tc>
-          <w:tcPr>
-            <w:tcW w:type="dxa" w:w="2160"/>
-          </w:tcPr>
-          <w:p>
-            <w:r>
-              <w:t>基准层收缩（步骤⑤）</w:t>
-            </w:r>
-          </w:p>
-        </w:tc>
-        <w:tc>
-          <w:tcPr>
-            <w:tcW w:type="dxa" w:w="2160"/>
-          </w:tcPr>
-          <w:p>
-            <w:r>
-              <w:t>全局</w:t>
-            </w:r>
-          </w:p>
-        </w:tc>
-        <w:tc>
-          <w:tcPr>
-            <w:tcW w:type="dxa" w:w="2160"/>
-          </w:tcPr>
-          <w:p>
-            <w:r>
-              <w:t>子层基准 vs 父层基准的混合比例</w:t>
+              <w:t>弱季节品类的非同月数据按此衰减。1个月前85%，6个月前38%</w:t>
             </w:r>
           </w:p>
         </w:tc>
@@ -583,46 +431,45 @@
     </w:tbl>
     <w:p/>
     <w:p>
-      <w:pPr>
-        <w:pStyle w:val="Heading1"/>
-      </w:pPr>
       <w:r>
-        <w:t>常见问题（FAQ）</w:t>
+        <w:t>分类逻辑：</w:t>
       </w:r>
     </w:p>
     <w:p>
-      <w:r/>
+      <w:pPr>
+        <w:pStyle w:val="ListBullet"/>
+      </w:pPr>
       <w:r>
-        <w:rPr>
-          <w:b/>
-        </w:rPr>
-        <w:t>Q1：季节匹配因子是默认按「庭院、草坪与花园/庭院」来，还是基于上传数据判断？</w:t>
+        <w:t>强季节品类（庭院等）：只看目标期同月数据，用 λ_same 衰减</w:t>
       </w:r>
-      <w:r/>
     </w:p>
     <w:p>
+      <w:pPr>
+        <w:pStyle w:val="ListBullet"/>
+      </w:pPr>
       <w:r>
-        <w:t>混合模式。上传数据后，系统从你的「一级分类」列提取所有唯一品类作为可选项，自动勾选其中名为「庭院、草坪与花园」和「庭院」的品类作为默认值。你可以手动增删。如果上传数据里不包含这两个品类名，则默认不勾选任何品类，季节因子不生效。</w:t>
+        <w:t>弱季节品类：同月数据用 λ_same 衰减，非同月数据用 λ 衰减</w:t>
+      </w:r>
+    </w:p>
+    <w:p>
+      <w:pPr>
+        <w:pStyle w:val="ListBullet"/>
+      </w:pPr>
+      <w:r>
+        <w:t>强季节品类的非同月数据权重为 0（不参与计算）</w:t>
+      </w:r>
+    </w:p>
+    <w:p>
+      <w:pPr>
+        <w:pStyle w:val="Heading2"/>
+      </w:pPr>
+      <w:r>
+        <w:t>3.3 季节匹配因子</w:t>
       </w:r>
     </w:p>
     <w:p>
       <w:r>
-        <w:t>――――――――――――――――――――――――――――――――――――――――</w:t>
-      </w:r>
-    </w:p>
-    <w:p>
-      <w:r/>
-      <w:r>
-        <w:rPr>
-          <w:b/>
-        </w:rPr>
-        <w:t>Q2：趋势因子和季节匹配因子作用一致吗？需要都保留吗？</w:t>
-      </w:r>
-      <w:r/>
-    </w:p>
-    <w:p>
-      <w:r>
-        <w:t>两者作用层级不同，不冲突，建议都保留：</w:t>
+        <w:t>对同月/同季数据的权重进行额外放大。作用于加权层，与趋势因子作用层不同，互不冲突。</w:t>
       </w:r>
     </w:p>
     <w:tbl>
@@ -646,6 +493,7 @@
               <w:rPr>
                 <w:b/>
               </w:rPr>
+              <w:t>参数</w:t>
             </w:r>
           </w:p>
         </w:tc>
@@ -658,7 +506,7 @@
               <w:rPr>
                 <w:b/>
               </w:rPr>
-              <w:t>季节匹配因子</w:t>
+              <w:t>默认值</w:t>
             </w:r>
           </w:p>
         </w:tc>
@@ -671,7 +519,7 @@
               <w:rPr>
                 <w:b/>
               </w:rPr>
-              <w:t>趋势因子</w:t>
+              <w:t>说明</w:t>
             </w:r>
           </w:p>
         </w:tc>
@@ -683,7 +531,7 @@
           </w:tcPr>
           <w:p>
             <w:r>
-              <w:t>作用步骤</w:t>
+              <w:t>强季节增强倍数 λ</w:t>
             </w:r>
           </w:p>
         </w:tc>
@@ -693,7 +541,7 @@
           </w:tcPr>
           <w:p>
             <w:r>
-              <w:t>③ 加权层</w:t>
+              <w:t>3.0</w:t>
             </w:r>
           </w:p>
         </w:tc>
@@ -703,7 +551,7 @@
           </w:tcPr>
           <w:p>
             <w:r>
-              <w:t>⑥ 最终占比层</w:t>
+              <w:t>强季节品类（庭院等）同季数据权重放大倍数</w:t>
             </w:r>
           </w:p>
         </w:tc>
@@ -715,7 +563,7 @@
           </w:tcPr>
           <w:p>
             <w:r>
-              <w:t>做什么</w:t>
+              <w:t>弱季节增强倍数 λ_weak</w:t>
             </w:r>
           </w:p>
         </w:tc>
@@ -725,7 +573,7 @@
           </w:tcPr>
           <w:p>
             <w:r>
-              <w:t>放大同季历史数据的权重</w:t>
+              <w:t>1.5</w:t>
             </w:r>
           </w:p>
         </w:tc>
@@ -735,7 +583,7 @@
           </w:tcPr>
           <w:p>
             <w:r>
-              <w:t>叠加年度趋势差到最终占比</w:t>
+              <w:t>弱季节品类同月数据权重放大倍数。1.0=不放大</w:t>
             </w:r>
           </w:p>
         </w:tc>
@@ -747,7 +595,7 @@
           </w:tcPr>
           <w:p>
             <w:r>
-              <w:t>影响范围</w:t>
+              <w:t>季节窗口范围 N</w:t>
             </w:r>
           </w:p>
         </w:tc>
@@ -757,7 +605,7 @@
           </w:tcPr>
           <w:p>
             <w:r>
-              <w:t>仅适用品类</w:t>
+              <w:t>1</w:t>
             </w:r>
           </w:p>
         </w:tc>
@@ -767,7 +615,79 @@
           </w:tcPr>
           <w:p>
             <w:r>
-              <w:t>全局（有趋势数据的SKU）</w:t>
+              <w:t>窗口 = 目标月前 N 个月（环形距离）。N=1：发1月货→命中12月</w:t>
+            </w:r>
+          </w:p>
+        </w:tc>
+      </w:tr>
+    </w:tbl>
+    <w:p/>
+    <w:p>
+      <w:r>
+        <w:t>适用品类：从上传数据中动态识别，默认勾选「庭院、草坪与花园」和「庭院」，可手动增删。</w:t>
+      </w:r>
+    </w:p>
+    <w:p>
+      <w:pPr>
+        <w:pStyle w:val="Heading2"/>
+      </w:pPr>
+      <w:r>
+        <w:t>3.4 趋势因子 α</w:t>
+      </w:r>
+    </w:p>
+    <w:p>
+      <w:r>
+        <w:t>比较「去年同期」与「前年同期」的分仓占比差，把趋势方向叠加到最终占比上。使用原始单量占比计算（不受衰减权重和季节因子干扰）。</w:t>
+      </w:r>
+    </w:p>
+    <w:tbl>
+      <w:tblPr>
+        <w:tblStyle w:val="LightGrid-Accent1"/>
+        <w:tblW w:type="auto" w:w="0"/>
+        <w:tblLook w:firstColumn="1" w:firstRow="1" w:lastColumn="0" w:lastRow="0" w:noHBand="0" w:noVBand="1" w:val="04A0"/>
+      </w:tblPr>
+      <w:tblGrid>
+        <w:gridCol w:w="2880"/>
+        <w:gridCol w:w="2880"/>
+        <w:gridCol w:w="2880"/>
+      </w:tblGrid>
+      <w:tr>
+        <w:tc>
+          <w:tcPr>
+            <w:tcW w:type="dxa" w:w="2880"/>
+          </w:tcPr>
+          <w:p>
+            <w:r>
+              <w:rPr>
+                <w:b/>
+              </w:rPr>
+              <w:t>参数</w:t>
+            </w:r>
+          </w:p>
+        </w:tc>
+        <w:tc>
+          <w:tcPr>
+            <w:tcW w:type="dxa" w:w="2880"/>
+          </w:tcPr>
+          <w:p>
+            <w:r>
+              <w:rPr>
+                <w:b/>
+              </w:rPr>
+              <w:t>默认值</w:t>
+            </w:r>
+          </w:p>
+        </w:tc>
+        <w:tc>
+          <w:tcPr>
+            <w:tcW w:type="dxa" w:w="2880"/>
+          </w:tcPr>
+          <w:p>
+            <w:r>
+              <w:rPr>
+                <w:b/>
+              </w:rPr>
+              <w:t>说明</w:t>
             </w:r>
           </w:p>
         </w:tc>
@@ -779,7 +699,7 @@
           </w:tcPr>
           <w:p>
             <w:r>
-              <w:t>关键参数</w:t>
+              <w:t>趋势因子 α</w:t>
             </w:r>
           </w:p>
         </w:tc>
@@ -789,7 +709,7 @@
           </w:tcPr>
           <w:p>
             <w:r>
-              <w:t>β、N</w:t>
+              <w:t>0.3</w:t>
             </w:r>
           </w:p>
         </w:tc>
@@ -799,7 +719,71 @@
           </w:tcPr>
           <w:p>
             <w:r>
-              <w:t>α、调整上限</w:t>
+              <w:t>趋势差 × α 叠加到最终占比。α=0 关闭</w:t>
+            </w:r>
+          </w:p>
+        </w:tc>
+      </w:tr>
+      <w:tr>
+        <w:tc>
+          <w:tcPr>
+            <w:tcW w:type="dxa" w:w="2880"/>
+          </w:tcPr>
+          <w:p>
+            <w:r>
+              <w:t>单仓调整上限</w:t>
+            </w:r>
+          </w:p>
+        </w:tc>
+        <w:tc>
+          <w:tcPr>
+            <w:tcW w:type="dxa" w:w="2880"/>
+          </w:tcPr>
+          <w:p>
+            <w:r>
+              <w:t>0.05</w:t>
+            </w:r>
+          </w:p>
+        </w:tc>
+        <w:tc>
+          <w:tcPr>
+            <w:tcW w:type="dxa" w:w="2880"/>
+          </w:tcPr>
+          <w:p>
+            <w:r>
+              <w:t>每个仓库的趋势调整幅度不超过 ±5%</w:t>
+            </w:r>
+          </w:p>
+        </w:tc>
+      </w:tr>
+      <w:tr>
+        <w:tc>
+          <w:tcPr>
+            <w:tcW w:type="dxa" w:w="2880"/>
+          </w:tcPr>
+          <w:p>
+            <w:r>
+              <w:t>归一化方式</w:t>
+            </w:r>
+          </w:p>
+        </w:tc>
+        <w:tc>
+          <w:tcPr>
+            <w:tcW w:type="dxa" w:w="2880"/>
+          </w:tcPr>
+          <w:p>
+            <w:r>
+              <w:t>归一化</w:t>
+            </w:r>
+          </w:p>
+        </w:tc>
+        <w:tc>
+          <w:tcPr>
+            <w:tcW w:type="dxa" w:w="2880"/>
+          </w:tcPr>
+          <w:p>
+            <w:r>
+              <w:t>调整后四仓占比缩放到合计 100%</w:t>
             </w:r>
           </w:p>
         </w:tc>
@@ -807,33 +791,16 @@
     </w:tbl>
     <w:p/>
     <w:p>
+      <w:pPr>
+        <w:pStyle w:val="Heading2"/>
+      </w:pPr>
       <w:r>
-        <w:t>简单说：季节因子让预测贴近去年同期的数据分布，趋势因子让预测跟随年度变化方向。两者互补。</w:t>
+        <w:t>3.5 新品与基准</w:t>
       </w:r>
     </w:p>
     <w:p>
       <w:r>
-        <w:t>――――――――――――――――――――――――――――――――――――――――</w:t>
-      </w:r>
-    </w:p>
-    <w:p>
-      <w:r/>
-      <w:r>
-        <w:rPr>
-          <w:b/>
-        </w:rPr>
-        <w:t>Q3：「品类层最小等效观测数」默认值12代表什么含义？</w:t>
-      </w:r>
-      <w:r/>
-    </w:p>
-    <w:p>
-      <w:r>
-        <w:t>这是基准计算中的贝叶斯收缩参数。公式为：子层权重 = n / (n + k_cat)</w:t>
-      </w:r>
-    </w:p>
-    <w:p>
-      <w:r>
-        <w:t>其中 n = 该层目标期的实际观测行数，k_cat = 此参数（默认12）。</w:t>
+        <w:t>控制新品判定和自身数据与基准的混合比例。</w:t>
       </w:r>
     </w:p>
     <w:tbl>
@@ -843,61 +810,47 @@
         <w:tblLook w:firstColumn="1" w:firstRow="1" w:lastColumn="0" w:lastRow="0" w:noHBand="0" w:noVBand="1" w:val="04A0"/>
       </w:tblPr>
       <w:tblGrid>
-        <w:gridCol w:w="2160"/>
-        <w:gridCol w:w="2160"/>
-        <w:gridCol w:w="2160"/>
-        <w:gridCol w:w="2160"/>
+        <w:gridCol w:w="2880"/>
+        <w:gridCol w:w="2880"/>
+        <w:gridCol w:w="2880"/>
       </w:tblGrid>
       <w:tr>
         <w:tc>
           <w:tcPr>
-            <w:tcW w:type="dxa" w:w="2160"/>
+            <w:tcW w:type="dxa" w:w="2880"/>
           </w:tcPr>
           <w:p>
             <w:r>
               <w:rPr>
                 <w:b/>
               </w:rPr>
-              <w:t>观测行数 n</w:t>
+              <w:t>参数</w:t>
             </w:r>
           </w:p>
         </w:tc>
         <w:tc>
           <w:tcPr>
-            <w:tcW w:type="dxa" w:w="2160"/>
+            <w:tcW w:type="dxa" w:w="2880"/>
           </w:tcPr>
           <w:p>
             <w:r>
               <w:rPr>
                 <w:b/>
               </w:rPr>
-              <w:t>子层权重</w:t>
+              <w:t>默认值</w:t>
             </w:r>
           </w:p>
         </w:tc>
         <w:tc>
           <w:tcPr>
-            <w:tcW w:type="dxa" w:w="2160"/>
+            <w:tcW w:type="dxa" w:w="2880"/>
           </w:tcPr>
           <w:p>
             <w:r>
               <w:rPr>
                 <w:b/>
               </w:rPr>
-              <w:t>父层权重</w:t>
-            </w:r>
-          </w:p>
-        </w:tc>
-        <w:tc>
-          <w:tcPr>
-            <w:tcW w:type="dxa" w:w="2160"/>
-          </w:tcPr>
-          <w:p>
-            <w:r>
-              <w:rPr>
-                <w:b/>
-              </w:rPr>
-              <w:t>含义</w:t>
+              <w:t>说明</w:t>
             </w:r>
           </w:p>
         </w:tc>
@@ -905,41 +858,31 @@
       <w:tr>
         <w:tc>
           <w:tcPr>
-            <w:tcW w:type="dxa" w:w="2160"/>
+            <w:tcW w:type="dxa" w:w="2880"/>
           </w:tcPr>
           <w:p>
             <w:r>
-              <w:t>n = 4</w:t>
+              <w:t>新品阈值（月）</w:t>
             </w:r>
           </w:p>
         </w:tc>
         <w:tc>
           <w:tcPr>
-            <w:tcW w:type="dxa" w:w="2160"/>
+            <w:tcW w:type="dxa" w:w="2880"/>
           </w:tcPr>
           <w:p>
             <w:r>
-              <w:t>25%</w:t>
+              <w:t>2</w:t>
             </w:r>
           </w:p>
         </w:tc>
         <w:tc>
           <w:tcPr>
-            <w:tcW w:type="dxa" w:w="2160"/>
+            <w:tcW w:type="dxa" w:w="2880"/>
           </w:tcPr>
           <w:p>
             <w:r>
-              <w:t>75%</w:t>
-            </w:r>
-          </w:p>
-        </w:tc>
-        <w:tc>
-          <w:tcPr>
-            <w:tcW w:type="dxa" w:w="2160"/>
-          </w:tcPr>
-          <w:p>
-            <w:r>
-              <w:t>数据太少，大部分用父层均值</w:t>
+              <w:t>历史出单月数 ≤ 此值的 SKU 视为新品，完全使用基准占比</w:t>
             </w:r>
           </w:p>
         </w:tc>
@@ -947,41 +890,31 @@
       <w:tr>
         <w:tc>
           <w:tcPr>
-            <w:tcW w:type="dxa" w:w="2160"/>
+            <w:tcW w:type="dxa" w:w="2880"/>
           </w:tcPr>
           <w:p>
             <w:r>
-              <w:t>n = 12</w:t>
+              <w:t>新品订单量门槛</w:t>
             </w:r>
           </w:p>
         </w:tc>
         <w:tc>
           <w:tcPr>
-            <w:tcW w:type="dxa" w:w="2160"/>
+            <w:tcW w:type="dxa" w:w="2880"/>
           </w:tcPr>
           <w:p>
             <w:r>
-              <w:t>50%</w:t>
+              <w:t>10</w:t>
             </w:r>
           </w:p>
         </w:tc>
         <w:tc>
           <w:tcPr>
-            <w:tcW w:type="dxa" w:w="2160"/>
+            <w:tcW w:type="dxa" w:w="2880"/>
           </w:tcPr>
           <w:p>
             <w:r>
-              <w:t>50%</w:t>
-            </w:r>
-          </w:p>
-        </w:tc>
-        <w:tc>
-          <w:tcPr>
-            <w:tcW w:type="dxa" w:w="2160"/>
-          </w:tcPr>
-          <w:p>
-            <w:r>
-              <w:t>临界点，子层和父层各半</w:t>
+              <w:t>目标期总单量 &lt; 此值也视为新品，避免低单量SKU分仓偶然性</w:t>
             </w:r>
           </w:p>
         </w:tc>
@@ -989,41 +922,127 @@
       <w:tr>
         <w:tc>
           <w:tcPr>
-            <w:tcW w:type="dxa" w:w="2160"/>
+            <w:tcW w:type="dxa" w:w="2880"/>
           </w:tcPr>
           <w:p>
             <w:r>
-              <w:t>n = 88</w:t>
+              <w:t>收缩强度 k</w:t>
             </w:r>
           </w:p>
         </w:tc>
         <w:tc>
           <w:tcPr>
-            <w:tcW w:type="dxa" w:w="2160"/>
+            <w:tcW w:type="dxa" w:w="2880"/>
           </w:tcPr>
           <w:p>
             <w:r>
-              <w:t>88%</w:t>
+              <w:t>6</w:t>
             </w:r>
           </w:p>
         </w:tc>
         <w:tc>
           <w:tcPr>
-            <w:tcW w:type="dxa" w:w="2160"/>
+            <w:tcW w:type="dxa" w:w="2880"/>
           </w:tcPr>
           <w:p>
             <w:r>
-              <w:t>12%</w:t>
+              <w:t>自身权重 = n / (n + k)，n = 目标期月数。k越大越信任基准</w:t>
+            </w:r>
+          </w:p>
+        </w:tc>
+      </w:tr>
+      <w:tr>
+        <w:tc>
+          <w:tcPr>
+            <w:tcW w:type="dxa" w:w="2880"/>
+          </w:tcPr>
+          <w:p>
+            <w:r>
+              <w:t>权重下限</w:t>
             </w:r>
           </w:p>
         </w:tc>
         <w:tc>
           <w:tcPr>
-            <w:tcW w:type="dxa" w:w="2160"/>
+            <w:tcW w:type="dxa" w:w="2880"/>
           </w:tcPr>
           <w:p>
             <w:r>
-              <w:t>数据充足，信任子层自身</w:t>
+              <w:t>0.0</w:t>
+            </w:r>
+          </w:p>
+        </w:tc>
+        <w:tc>
+          <w:tcPr>
+            <w:tcW w:type="dxa" w:w="2880"/>
+          </w:tcPr>
+          <w:p>
+            <w:r>
+              <w:t>自身数据的最低权重。0=新品完全用基准</w:t>
+            </w:r>
+          </w:p>
+        </w:tc>
+      </w:tr>
+      <w:tr>
+        <w:tc>
+          <w:tcPr>
+            <w:tcW w:type="dxa" w:w="2880"/>
+          </w:tcPr>
+          <w:p>
+            <w:r>
+              <w:t>权重上限</w:t>
+            </w:r>
+          </w:p>
+        </w:tc>
+        <w:tc>
+          <w:tcPr>
+            <w:tcW w:type="dxa" w:w="2880"/>
+          </w:tcPr>
+          <w:p>
+            <w:r>
+              <w:t>0.9</w:t>
+            </w:r>
+          </w:p>
+        </w:tc>
+        <w:tc>
+          <w:tcPr>
+            <w:tcW w:type="dxa" w:w="2880"/>
+          </w:tcPr>
+          <w:p>
+            <w:r>
+              <w:t>自身数据的最高权重</w:t>
+            </w:r>
+          </w:p>
+        </w:tc>
+      </w:tr>
+      <w:tr>
+        <w:tc>
+          <w:tcPr>
+            <w:tcW w:type="dxa" w:w="2880"/>
+          </w:tcPr>
+          <w:p>
+            <w:r>
+              <w:t>品类层最小等效观测数</w:t>
+            </w:r>
+          </w:p>
+        </w:tc>
+        <w:tc>
+          <w:tcPr>
+            <w:tcW w:type="dxa" w:w="2880"/>
+          </w:tcPr>
+          <w:p>
+            <w:r>
+              <w:t>12</w:t>
+            </w:r>
+          </w:p>
+        </w:tc>
+        <w:tc>
+          <w:tcPr>
+            <w:tcW w:type="dxa" w:w="2880"/>
+          </w:tcPr>
+          <w:p>
+            <w:r>
+              <w:t>基准贝叶斯收缩参数。n=12时子层父层各50%</w:t>
             </w:r>
           </w:p>
         </w:tc>
@@ -1032,102 +1051,733 @@
     <w:p/>
     <w:p>
       <w:r>
-        <w:t>k_cat 越大越保守——子层样本少时更快被拉向上层均值。</w:t>
+        <w:t>新品判定逻辑：历史月数 ≤ 阈值 或 目标期总单量 &lt; 门槛 → 视为新品，自身权重=0，完全使用基准占比。</w:t>
+      </w:r>
+    </w:p>
+    <w:p>
+      <w:pPr>
+        <w:pStyle w:val="Heading1"/>
+      </w:pPr>
+      <w:r>
+        <w:t>4. 主区域操作指南</w:t>
+      </w:r>
+    </w:p>
+    <w:p>
+      <w:pPr>
+        <w:pStyle w:val="Heading2"/>
+      </w:pPr>
+      <w:r>
+        <w:t>4.1 上传数据</w:t>
       </w:r>
     </w:p>
     <w:p>
       <w:r>
-        <w:t>――――――――――――――――――――――――――――――――――――――――</w:t>
-      </w:r>
-    </w:p>
-    <w:p>
-      <w:r/>
-      <w:r>
-        <w:rPr>
-          <w:b/>
-        </w:rPr>
-        <w:t>Q4：「季节增强倍数」默认值3.0代表什么含义？</w:t>
-      </w:r>
-      <w:r/>
-    </w:p>
-    <w:p>
-      <w:r>
-        <w:t>β=3.0 表示：落在季节窗口内的历史数据，其权重被放大3倍。</w:t>
+        <w:t>点击「上传原始出单数据」或使用示例数据。必需列：源SKU、SPU、室内外、一级分类、年、月、美西、美东、美南GA、美南TX。</w:t>
       </w:r>
     </w:p>
     <w:p>
       <w:r>
-        <w:t>例如：某行数据原始衰减权重为 0.5，在季节窗口内则变为 0.5 × 3.0 = 1.5。非季节性品类的数据权重不变（× 1.0）。</w:t>
+        <w:t>上传后可展开「数据体检 + 预览」查看总行数、SKU数、品类数、时间跨度。</w:t>
+      </w:r>
+    </w:p>
+    <w:p>
+      <w:pPr>
+        <w:pStyle w:val="Heading2"/>
+      </w:pPr>
+      <w:r>
+        <w:t>4.2 开始计算</w:t>
       </w:r>
     </w:p>
     <w:p>
       <w:r>
-        <w:t>这让去年同季的数据在加权计算中占据主导地位，尤其适用于「庭院、草坪与花园」等强季节性品类。</w:t>
+        <w:t>在主页面蓝色边框容器内设置：</w:t>
+      </w:r>
+    </w:p>
+    <w:p>
+      <w:pPr>
+        <w:pStyle w:val="ListBullet"/>
+      </w:pPr>
+      <w:r>
+        <w:t>季节适用品类：多选框，默认勾选庭院类品类</w:t>
+      </w:r>
+    </w:p>
+    <w:p>
+      <w:pPr>
+        <w:pStyle w:val="ListBullet"/>
+      </w:pPr>
+      <w:r>
+        <w:t>减仓优化：勾选开关，启用后月均&lt;3单且占比&lt;5%的仓位自动减仓</w:t>
+      </w:r>
+    </w:p>
+    <w:p>
+      <w:pPr>
+        <w:pStyle w:val="ListBullet"/>
+      </w:pPr>
+      <w:r>
+        <w:t>点击「开始计算」按钮，系统分7步逐步显示计算进度</w:t>
+      </w:r>
+    </w:p>
+    <w:p>
+      <w:pPr>
+        <w:pStyle w:val="Heading2"/>
+      </w:pPr>
+      <w:r>
+        <w:t>4.3 计算结果</w:t>
       </w:r>
     </w:p>
     <w:p>
       <w:r>
-        <w:t>――――――――――――――――――――――――――――――――――――――――</w:t>
+        <w:t>计算完成后展示：</w:t>
       </w:r>
     </w:p>
     <w:p>
-      <w:r/>
+      <w:pPr>
+        <w:pStyle w:val="ListBullet"/>
+      </w:pPr>
       <w:r>
-        <w:rPr>
-          <w:b/>
-        </w:rPr>
-        <w:t>Q5：4个仓库的占比加起来必须等于100%，能实现吗？</w:t>
+        <w:t>自动体检：四仓占比合计=100%、季节因子命中行数、趋势因子生效数</w:t>
       </w:r>
-      <w:r/>
     </w:p>
     <w:p>
+      <w:pPr>
+        <w:pStyle w:val="ListBullet"/>
+      </w:pPr>
       <w:r>
-        <w:t>已实现，三层保障：</w:t>
+        <w:t>KPI卡片：美西、美东、美南GA、美南TX 四仓平均占比</w:t>
+      </w:r>
+    </w:p>
+    <w:p>
+      <w:pPr>
+        <w:pStyle w:val="ListBullet"/>
+      </w:pPr>
+      <w:r>
+        <w:t>SKU级表格：5个分页Tab（调整后/最终/自身/基准/趋势差），每个Tab只显示4仓+基础列</w:t>
+      </w:r>
+    </w:p>
+    <w:p>
+      <w:pPr>
+        <w:pStyle w:val="ListBullet"/>
+      </w:pPr>
+      <w:r>
+        <w:t>聚合层级：一级分类、室内外、SPU、全公司四个 Tab，展示各层级的分仓占比</w:t>
+      </w:r>
+    </w:p>
+    <w:p>
+      <w:pPr>
+        <w:pStyle w:val="Heading2"/>
+      </w:pPr>
+      <w:r>
+        <w:t>4.4 占比微调</w:t>
       </w:r>
     </w:p>
     <w:p>
       <w:r>
-        <w:t>1. 引擎层：Step6 计算完最终占比后自动归一化，四仓合计 = 100%</w:t>
+        <w:t>对某个 SKU 的分仓占比有业务判断时，可在此直接修改。</w:t>
+      </w:r>
+    </w:p>
+    <w:p>
+      <w:pPr>
+        <w:pStyle w:val="ListBullet"/>
+      </w:pPr>
+      <w:r>
+        <w:t>选择要微调的 SKU，拖动四个滑块调整占比</w:t>
+      </w:r>
+    </w:p>
+    <w:p>
+      <w:pPr>
+        <w:pStyle w:val="ListBullet"/>
+      </w:pPr>
+      <w:r>
+        <w:t>实时显示四仓合计是否=100%</w:t>
+      </w:r>
+    </w:p>
+    <w:p>
+      <w:pPr>
+        <w:pStyle w:val="ListBullet"/>
+      </w:pPr>
+      <w:r>
+        <w:t>点击「按改动自动补足到 100%」，以改动最大的仓为准，其余三仓按原比例自动补足</w:t>
+      </w:r>
+    </w:p>
+    <w:p>
+      <w:pPr>
+        <w:pStyle w:val="ListBullet"/>
+      </w:pPr>
+      <w:r>
+        <w:t>输入发运批量，按修正后的占比生成落货量（最大余额法保证整数精确）</w:t>
+      </w:r>
+    </w:p>
+    <w:p>
+      <w:pPr>
+        <w:pStyle w:val="ListBullet"/>
+      </w:pPr>
+      <w:r>
+        <w:t>可下载该 SKU 的调整结果 CSV</w:t>
+      </w:r>
+    </w:p>
+    <w:p>
+      <w:pPr>
+        <w:pStyle w:val="Heading2"/>
+      </w:pPr>
+      <w:r>
+        <w:t>4.5 可视化</w:t>
+      </w:r>
+    </w:p>
+    <w:p>
+      <w:pPr>
+        <w:pStyle w:val="ListBullet"/>
+      </w:pPr>
+      <w:r>
+        <w:t>饼图：展示单个 SKU 的四仓占比，含标签和百分比</w:t>
+      </w:r>
+    </w:p>
+    <w:p>
+      <w:pPr>
+        <w:pStyle w:val="ListBullet"/>
+      </w:pPr>
+      <w:r>
+        <w:t>堆叠图：支持按 SKU 名搜索，可调整每页显示数量（10-100），合计恒为 100%</w:t>
+      </w:r>
+    </w:p>
+    <w:p>
+      <w:pPr>
+        <w:pStyle w:val="Heading2"/>
+      </w:pPr>
+      <w:r>
+        <w:t>4.6 导出结果</w:t>
+      </w:r>
+    </w:p>
+    <w:p>
+      <w:pPr>
+        <w:pStyle w:val="ListBullet"/>
+      </w:pPr>
+      <w:r>
+        <w:t>Excel（含聚合）：SKU级占比 + 一级分类/室内外/SPU/全公司聚合</w:t>
+      </w:r>
+    </w:p>
+    <w:p>
+      <w:pPr>
+        <w:pStyle w:val="ListBullet"/>
+      </w:pPr>
+      <w:r>
+        <w:t>CSV（SKU级）：仅 SKU 级占比数据</w:t>
+      </w:r>
+    </w:p>
+    <w:p>
+      <w:pPr>
+        <w:pStyle w:val="ListBullet"/>
+      </w:pPr>
+      <w:r>
+        <w:t>CSV（一级分类）：仅一级分类聚合占比</w:t>
+      </w:r>
+    </w:p>
+    <w:p>
+      <w:pPr>
+        <w:pStyle w:val="Heading1"/>
+      </w:pPr>
+      <w:r>
+        <w:t>5. 计算逻辑说明</w:t>
       </w:r>
     </w:p>
     <w:p>
       <w:r>
-        <w:t>2. 侧边栏开关：「归一化（四仓合计=100%）」默认开启，趋势调整后再次归一化</w:t>
+        <w:t>计算链路共7步，点击「开始计算」后逐步显示进度：</w:t>
+      </w:r>
+    </w:p>
+    <w:p>
+      <w:pPr>
+        <w:pStyle w:val="Heading2"/>
+      </w:pPr>
+      <w:r>
+        <w:t>步骤1：运算SKU映射</w:t>
       </w:r>
     </w:p>
     <w:p>
       <w:r>
-        <w:t>3. 微调区：改一个仓的占比，其余三仓按原比例自动补足，合计锁定 100%</w:t>
+        <w:t>混用SKU映射表把源SKU合并到相似SKU；未映射的取「-」前部分作为运算SKU。</w:t>
+      </w:r>
+    </w:p>
+    <w:p>
+      <w:pPr>
+        <w:pStyle w:val="Heading2"/>
+      </w:pPr>
+      <w:r>
+        <w:t>步骤2：时间衰减加权</w:t>
       </w:r>
     </w:p>
     <w:p>
       <w:r>
-        <w:t>4. 自检：计算后自动验证「最终占比」和「调整后占比」的合计偏差 &lt; 1e-9</w:t>
+        <w:t>强季节品类只看目标期同月数据，用 λ_same（0.95）跨年衰减。弱季节品类放开全部月份，同月用 λ_same，非同月用 λ（0.85）。</w:t>
+      </w:r>
+    </w:p>
+    <w:p>
+      <w:pPr>
+        <w:pStyle w:val="Heading2"/>
+      </w:pPr>
+      <w:r>
+        <w:t>步骤3：季节匹配因子</w:t>
       </w:r>
     </w:p>
     <w:p>
       <w:r>
-        <w:t>落货量分配使用最大余额法，保证整数合计精确等于发运批量。</w:t>
+        <w:t>强季节品类 + 季节窗口内 → 权重 × λ（3.0）。弱季节品类 + 同月 → 权重 × λ_weak（1.5）。其他 × 1.0。</w:t>
+      </w:r>
+    </w:p>
+    <w:p>
+      <w:pPr>
+        <w:pStyle w:val="Heading2"/>
+      </w:pPr>
+      <w:r>
+        <w:t>步骤4：自身占比</w:t>
       </w:r>
     </w:p>
     <w:p>
       <w:r>
-        <w:t>――――――――――――――――――――――――――――――――――――――――</w:t>
+        <w:t>加权后的各仓出单量 ÷ 加权合计，逐仓计算。</w:t>
       </w:r>
     </w:p>
     <w:p>
-      <w:r/>
+      <w:pPr>
+        <w:pStyle w:val="Heading2"/>
+      </w:pPr>
       <w:r>
-        <w:rPr>
-          <w:b/>
-        </w:rPr>
-        <w:t>Q6：「减仓优化」是什么？</w:t>
+        <w:t>步骤5：基准占比</w:t>
       </w:r>
-      <w:r/>
     </w:p>
     <w:p>
       <w:r>
-        <w:t>侧边栏「减仓优化」开关，默认关闭。启用后，月均单量&lt;3单且分仓占比&lt;5%的仓点会被减仓，其占比按其他仓现有比例等比分配并归一化到100%。仅影响SKU层分仓占比，上层聚合使用减仓前原始数据。导出时SKU表增加「是否减仓」列备注。</w:t>
+        <w:t>层级回退 + 贝叶斯收缩：</w:t>
+      </w:r>
+    </w:p>
+    <w:tbl>
+      <w:tblPr>
+        <w:tblStyle w:val="LightGrid-Accent1"/>
+        <w:tblW w:type="auto" w:w="0"/>
+        <w:tblLook w:firstColumn="1" w:firstRow="1" w:lastColumn="0" w:lastRow="0" w:noHBand="0" w:noVBand="1" w:val="04A0"/>
+      </w:tblPr>
+      <w:tblGrid>
+        <w:gridCol w:w="2880"/>
+        <w:gridCol w:w="2880"/>
+        <w:gridCol w:w="2880"/>
+      </w:tblGrid>
+      <w:tr>
+        <w:tc>
+          <w:tcPr>
+            <w:tcW w:type="dxa" w:w="2880"/>
+          </w:tcPr>
+          <w:p>
+            <w:r>
+              <w:rPr>
+                <w:b/>
+              </w:rPr>
+              <w:t>优先级</w:t>
+            </w:r>
+          </w:p>
+        </w:tc>
+        <w:tc>
+          <w:tcPr>
+            <w:tcW w:type="dxa" w:w="2880"/>
+          </w:tcPr>
+          <w:p>
+            <w:r>
+              <w:rPr>
+                <w:b/>
+              </w:rPr>
+              <w:t>基准来源</w:t>
+            </w:r>
+          </w:p>
+        </w:tc>
+        <w:tc>
+          <w:tcPr>
+            <w:tcW w:type="dxa" w:w="2880"/>
+          </w:tcPr>
+          <w:p>
+            <w:r>
+              <w:rPr>
+                <w:b/>
+              </w:rPr>
+              <w:t>说明</w:t>
+            </w:r>
+          </w:p>
+        </w:tc>
+      </w:tr>
+      <w:tr>
+        <w:tc>
+          <w:tcPr>
+            <w:tcW w:type="dxa" w:w="2880"/>
+          </w:tcPr>
+          <w:p>
+            <w:r>
+              <w:t>1</w:t>
+            </w:r>
+          </w:p>
+        </w:tc>
+        <w:tc>
+          <w:tcPr>
+            <w:tcW w:type="dxa" w:w="2880"/>
+          </w:tcPr>
+          <w:p>
+            <w:r>
+              <w:t>SPU（预存）</w:t>
+            </w:r>
+          </w:p>
+        </w:tc>
+        <w:tc>
+          <w:tcPr>
+            <w:tcW w:type="dxa" w:w="2880"/>
+          </w:tcPr>
+          <w:p>
+            <w:r>
+              <w:t>sheet4中预存的SPU基准，有观测数时使用</w:t>
+            </w:r>
+          </w:p>
+        </w:tc>
+      </w:tr>
+      <w:tr>
+        <w:tc>
+          <w:tcPr>
+            <w:tcW w:type="dxa" w:w="2880"/>
+          </w:tcPr>
+          <w:p>
+            <w:r>
+              <w:t>2</w:t>
+            </w:r>
+          </w:p>
+        </w:tc>
+        <w:tc>
+          <w:tcPr>
+            <w:tcW w:type="dxa" w:w="2880"/>
+          </w:tcPr>
+          <w:p>
+            <w:r>
+              <w:t>SPU（动态）</w:t>
+            </w:r>
+          </w:p>
+        </w:tc>
+        <w:tc>
+          <w:tcPr>
+            <w:tcW w:type="dxa" w:w="2880"/>
+          </w:tcPr>
+          <w:p>
+            <w:r>
+              <w:t>贝叶斯收缩，父层=所属一级分类</w:t>
+            </w:r>
+          </w:p>
+        </w:tc>
+      </w:tr>
+      <w:tr>
+        <w:tc>
+          <w:tcPr>
+            <w:tcW w:type="dxa" w:w="2880"/>
+          </w:tcPr>
+          <w:p>
+            <w:r>
+              <w:t>3</w:t>
+            </w:r>
+          </w:p>
+        </w:tc>
+        <w:tc>
+          <w:tcPr>
+            <w:tcW w:type="dxa" w:w="2880"/>
+          </w:tcPr>
+          <w:p>
+            <w:r>
+              <w:t>一级分类（预存）</w:t>
+            </w:r>
+          </w:p>
+        </w:tc>
+        <w:tc>
+          <w:tcPr>
+            <w:tcW w:type="dxa" w:w="2880"/>
+          </w:tcPr>
+          <w:p>
+            <w:r>
+              <w:t>预存的一级分类基准</w:t>
+            </w:r>
+          </w:p>
+        </w:tc>
+      </w:tr>
+      <w:tr>
+        <w:tc>
+          <w:tcPr>
+            <w:tcW w:type="dxa" w:w="2880"/>
+          </w:tcPr>
+          <w:p>
+            <w:r>
+              <w:t>4</w:t>
+            </w:r>
+          </w:p>
+        </w:tc>
+        <w:tc>
+          <w:tcPr>
+            <w:tcW w:type="dxa" w:w="2880"/>
+          </w:tcPr>
+          <w:p>
+            <w:r>
+              <w:t>一级分类（动态）</w:t>
+            </w:r>
+          </w:p>
+        </w:tc>
+        <w:tc>
+          <w:tcPr>
+            <w:tcW w:type="dxa" w:w="2880"/>
+          </w:tcPr>
+          <w:p>
+            <w:r>
+              <w:t>贝叶斯收缩，父层=全公司</w:t>
+            </w:r>
+          </w:p>
+        </w:tc>
+      </w:tr>
+      <w:tr>
+        <w:tc>
+          <w:tcPr>
+            <w:tcW w:type="dxa" w:w="2880"/>
+          </w:tcPr>
+          <w:p>
+            <w:r>
+              <w:t>5</w:t>
+            </w:r>
+          </w:p>
+        </w:tc>
+        <w:tc>
+          <w:tcPr>
+            <w:tcW w:type="dxa" w:w="2880"/>
+          </w:tcPr>
+          <w:p>
+            <w:r>
+              <w:t>室内外（预存）</w:t>
+            </w:r>
+          </w:p>
+        </w:tc>
+        <w:tc>
+          <w:tcPr>
+            <w:tcW w:type="dxa" w:w="2880"/>
+          </w:tcPr>
+          <w:p>
+            <w:r>
+              <w:t>预存的室内外基准</w:t>
+            </w:r>
+          </w:p>
+        </w:tc>
+      </w:tr>
+      <w:tr>
+        <w:tc>
+          <w:tcPr>
+            <w:tcW w:type="dxa" w:w="2880"/>
+          </w:tcPr>
+          <w:p>
+            <w:r>
+              <w:t>6</w:t>
+            </w:r>
+          </w:p>
+        </w:tc>
+        <w:tc>
+          <w:tcPr>
+            <w:tcW w:type="dxa" w:w="2880"/>
+          </w:tcPr>
+          <w:p>
+            <w:r>
+              <w:t>室内外（动态）</w:t>
+            </w:r>
+          </w:p>
+        </w:tc>
+        <w:tc>
+          <w:tcPr>
+            <w:tcW w:type="dxa" w:w="2880"/>
+          </w:tcPr>
+          <w:p>
+            <w:r>
+              <w:t>贝叶斯收缩，父层=全公司</w:t>
+            </w:r>
+          </w:p>
+        </w:tc>
+      </w:tr>
+      <w:tr>
+        <w:tc>
+          <w:tcPr>
+            <w:tcW w:type="dxa" w:w="2880"/>
+          </w:tcPr>
+          <w:p>
+            <w:r>
+              <w:t>7</w:t>
+            </w:r>
+          </w:p>
+        </w:tc>
+        <w:tc>
+          <w:tcPr>
+            <w:tcW w:type="dxa" w:w="2880"/>
+          </w:tcPr>
+          <w:p>
+            <w:r>
+              <w:t>全公司</w:t>
+            </w:r>
+          </w:p>
+        </w:tc>
+        <w:tc>
+          <w:tcPr>
+            <w:tcW w:type="dxa" w:w="2880"/>
+          </w:tcPr>
+          <w:p>
+            <w:r>
+              <w:t>整体占比兖底</w:t>
+            </w:r>
+          </w:p>
+        </w:tc>
+      </w:tr>
+    </w:tbl>
+    <w:p/>
+    <w:p>
+      <w:r>
+        <w:t>贝叶斯收缩公式：子层权重 = n / (n + k_cat)，父层权重 = k_cat / (n + k_cat)。k_cat=12时，n=12则子层父层各50%。</w:t>
+      </w:r>
+    </w:p>
+    <w:p>
+      <w:pPr>
+        <w:pStyle w:val="Heading2"/>
+      </w:pPr>
+      <w:r>
+        <w:t>步骤6：最终占比</w:t>
+      </w:r>
+    </w:p>
+    <w:p>
+      <w:r>
+        <w:t>最终占比 = 自身权重 × 自身占比 + (1-自身权重) × 基准占比，再叠加趋势调整，最后归一化到 100%。</w:t>
+      </w:r>
+    </w:p>
+    <w:p>
+      <w:r>
+        <w:t>新品（历史月数≤2 或 目标期单量&lt;10）自身权重=0，完全使用基准。</w:t>
+      </w:r>
+    </w:p>
+    <w:p>
+      <w:r>
+        <w:t>趋势调整用原始单量占比（不受衰减和季节因子干扰），比较去年同期 vs 前年同期的占比差。</w:t>
+      </w:r>
+    </w:p>
+    <w:p>
+      <w:pPr>
+        <w:pStyle w:val="Heading2"/>
+      </w:pPr>
+      <w:r>
+        <w:t>步骤7：落货量</w:t>
+      </w:r>
+    </w:p>
+    <w:p>
+      <w:r>
+        <w:t>占比 × 批量，最大余额法保证整数合计精确等于批量。</w:t>
+      </w:r>
+    </w:p>
+    <w:p>
+      <w:pPr>
+        <w:pStyle w:val="Heading2"/>
+      </w:pPr>
+      <w:r>
+        <w:t>减仓优化（可选）</w:t>
+      </w:r>
+    </w:p>
+    <w:p>
+      <w:r>
+        <w:t>启用后，对运算SKU × 仓点判断：月均&lt;3单且占比&lt;5%的仓位被减仓，占比等比分配到其他仓，归一化到100%。仅影响SKU层，上层聚合使用减仓前原始数据。</w:t>
+      </w:r>
+    </w:p>
+    <w:p>
+      <w:pPr>
+        <w:pStyle w:val="Heading1"/>
+      </w:pPr>
+      <w:r>
+        <w:t>6. 常见问题</w:t>
+      </w:r>
+    </w:p>
+    <w:p>
+      <w:pPr>
+        <w:pStyle w:val="Heading2"/>
+      </w:pPr>
+      <w:r>
+        <w:t>Q: 目标期设定为 5月，趋势因子参考哪些时间？</w:t>
+      </w:r>
+    </w:p>
+    <w:p>
+      <w:r>
+        <w:t>A: 趋势因子比较去年同期（2026年5月）与前年同期（2025年5月）的原始单量占比差。多月目标期（如4-6月）则参考4-6月。</w:t>
+      </w:r>
+    </w:p>
+    <w:p>
+      <w:pPr>
+        <w:pStyle w:val="Heading2"/>
+      </w:pPr>
+      <w:r>
+        <w:t>Q: 强季节和弱季节品类怎么区分？</w:t>
+      </w:r>
+    </w:p>
+    <w:p>
+      <w:r>
+        <w:t>A: 强季节品类 = 侧边栏「季节适用品类」多选框中勾选的品类（默认庭院类）。不在列表中的品类自动归为弱季节。</w:t>
+      </w:r>
+    </w:p>
+    <w:p>
+      <w:pPr>
+        <w:pStyle w:val="Heading2"/>
+      </w:pPr>
+      <w:r>
+        <w:t>Q: 同月跨年衰减率 λ_same 和非同月衰减率 λ 有什么区别？</w:t>
+      </w:r>
+    </w:p>
+    <w:p>
+      <w:r>
+        <w:t>A: λ_same（0.95）用于同月数据跨年衰减，去年同月保留95%，前年同月保留90%。λ（0.85）用于弱季节品类的非同月数据衰减，1个月前85%，6个月前38%。同月数据参考价值更高，所以衰减更慢。</w:t>
+      </w:r>
+    </w:p>
+    <w:p>
+      <w:pPr>
+        <w:pStyle w:val="Heading2"/>
+      </w:pPr>
+      <w:r>
+        <w:t>Q: 新品怎么判定？</w:t>
+      </w:r>
+    </w:p>
+    <w:p>
+      <w:r>
+        <w:t>A: 历史出单月数 ≤ 2 或 目标期总单量 &lt; 10，满足任一即视为新品。新品自身权重=0，完全使用基准占比（从 SPU 到全公司逐级回退）。</w:t>
+      </w:r>
+    </w:p>
+    <w:p>
+      <w:pPr>
+        <w:pStyle w:val="Heading2"/>
+      </w:pPr>
+      <w:r>
+        <w:t>Q: 减仓优化影响上层聚合吗？</w:t>
+      </w:r>
+    </w:p>
+    <w:p>
+      <w:r>
+        <w:t>A: 不影响。减仓仅修改 SKU 层的「调整后」列，一级分类/室内外/SPU/全公司的聚合使用减仓前的原始数据。</w:t>
+      </w:r>
+    </w:p>
+    <w:p>
+      <w:pPr>
+        <w:pStyle w:val="Heading2"/>
+      </w:pPr>
+      <w:r>
+        <w:t>Q: 四仓占比一定等于100%吗？</w:t>
+      </w:r>
+    </w:p>
+    <w:p>
+      <w:r>
+        <w:t>A: 是的。引擎计算后自动归一化，趋势调整后再次归一化，微调时自动补足，自检验证偏差 &lt; 1e-9。</w:t>
+      </w:r>
+    </w:p>
+    <w:p>
+      <w:pPr>
+        <w:pStyle w:val="Heading2"/>
+      </w:pPr>
+      <w:r>
+        <w:t>Q: 趋势因子和季节因子会冲突吗？</w:t>
+      </w:r>
+    </w:p>
+    <w:p>
+      <w:r>
+        <w:t>A: 不会。季节因子作用于加权层（步骤3），趋势因子作用于最终占比层（步骤6），两者作用层不同。趋势因子用原始数据计算，不受衰减和季节因子干扰。</w:t>
       </w:r>
     </w:p>
     <w:sectPr>

</xml_diff>

<commit_message>
docs: 7 doc optimizations - TOC, page break, header/footer page numbers, column widths, FAQ numbering, generation date, data format example
</commit_message>
<xml_diff>
--- a/分仓占比计算引擎_使用说明.docx
+++ b/分仓占比计算引擎_使用说明.docx
@@ -2,6 +2,12 @@
 <file path=word/document.xml><?xml version="1.0" encoding="utf-8"?>
 <w:document xmlns:wpc="http://schemas.microsoft.com/office/word/2010/wordprocessingCanvas" xmlns:mo="http://schemas.microsoft.com/office/mac/office/2008/main" xmlns:mc="http://schemas.openxmlformats.org/markup-compatibility/2006" xmlns:mv="urn:schemas-microsoft-com:mac:vml" xmlns:o="urn:schemas-microsoft-com:office:office" xmlns:r="http://schemas.openxmlformats.org/officeDocument/2006/relationships" xmlns:m="http://schemas.openxmlformats.org/officeDocument/2006/math" xmlns:v="urn:schemas-microsoft-com:vml" xmlns:wp14="http://schemas.microsoft.com/office/word/2010/wordprocessingDrawing" xmlns:wp="http://schemas.openxmlformats.org/drawingml/2006/wordprocessingDrawing" xmlns:w10="urn:schemas-microsoft-com:office:word" xmlns:w="http://schemas.openxmlformats.org/wordprocessingml/2006/main" xmlns:w14="http://schemas.microsoft.com/office/word/2010/wordml" xmlns:wpg="http://schemas.microsoft.com/office/word/2010/wordprocessingGroup" xmlns:wpi="http://schemas.microsoft.com/office/word/2010/wordprocessingInk" xmlns:wne="http://schemas.microsoft.com/office/word/2006/wordml" xmlns:wps="http://schemas.microsoft.com/office/word/2010/wordprocessingShape" mc:Ignorable="w14 wp14">
   <w:body>
+    <w:p/>
+    <w:p/>
+    <w:p/>
+    <w:p/>
+    <w:p/>
+    <w:p/>
     <w:p>
       <w:pPr>
         <w:jc w:val="center"/>
@@ -10,7 +16,7 @@
         <w:rPr>
           <w:b/>
           <w:color w:val="1A5CB0"/>
-          <w:sz w:val="44"/>
+          <w:sz w:val="52"/>
         </w:rPr>
         <w:t>分仓占比计算引擎</w:t>
       </w:r>
@@ -22,11 +28,12 @@
       <w:r>
         <w:rPr>
           <w:color w:val="555555"/>
-          <w:sz w:val="28"/>
+          <w:sz w:val="32"/>
         </w:rPr>
         <w:t>使用说明</w:t>
       </w:r>
     </w:p>
+    <w:p/>
     <w:p>
       <w:pPr>
         <w:jc w:val="center"/>
@@ -34,7 +41,7 @@
       <w:r>
         <w:rPr>
           <w:color w:val="888888"/>
-          <w:sz w:val="20"/>
+          <w:sz w:val="22"/>
         </w:rPr>
         <w:t>上传历史出单数据 → 调节参数 → 计算各仓库发货占比 → 导出结果</w:t>
       </w:r>
@@ -46,11 +53,12 @@
       <w:r>
         <w:rPr>
           <w:color w:val="888888"/>
-          <w:sz w:val="20"/>
+          <w:sz w:val="22"/>
         </w:rPr>
         <w:t>四仓占比合计恒为 100%  |  最大余额法保证落货量整数精确  |  自动体检防静默失效</w:t>
       </w:r>
     </w:p>
+    <w:p/>
     <w:p>
       <w:pPr>
         <w:jc w:val="right"/>
@@ -60,10 +68,41 @@
           <w:color w:val="999999"/>
           <w:sz w:val="18"/>
         </w:rPr>
-        <w:t>自动生成 | 随代码同步更新</w:t>
+        <w:t>生成日期：2026-09-20  |  随代码同步更新</w:t>
       </w:r>
     </w:p>
-    <w:p/>
+    <w:p>
+      <w:r>
+        <w:br w:type="page"/>
+      </w:r>
+    </w:p>
+    <w:p>
+      <w:pPr>
+        <w:jc w:val="center"/>
+      </w:pPr>
+      <w:r>
+        <w:rPr>
+          <w:b/>
+          <w:color w:val="1A5CB0"/>
+          <w:sz w:val="32"/>
+        </w:rPr>
+        <w:t>目录</w:t>
+      </w:r>
+    </w:p>
+    <w:p>
+      <w:r>
+        <w:fldChar w:fldCharType="begin"/>
+        <w:instrText xml:space="preserve">TOC \o "1-2" \h \z \u</w:instrText>
+        <w:fldChar w:fldCharType="separate"/>
+        <w:t>右键更新域以生成目录</w:t>
+        <w:fldChar w:fldCharType="end"/>
+      </w:r>
+    </w:p>
+    <w:p>
+      <w:r>
+        <w:br w:type="page"/>
+      </w:r>
+    </w:p>
     <w:p>
       <w:pPr>
         <w:pStyle w:val="Heading1"/>
@@ -316,6 +355,7 @@
       <w:tblPr>
         <w:tblStyle w:val="LightGrid-Accent1"/>
         <w:tblW w:type="auto" w:w="0"/>
+        <w:tblLayout w:type="fixed"/>
         <w:tblLook w:firstColumn="1" w:firstRow="1" w:lastColumn="0" w:lastRow="0" w:noHBand="0" w:noVBand="1" w:val="04A0"/>
       </w:tblPr>
       <w:tblGrid>
@@ -326,7 +366,7 @@
       <w:tr>
         <w:tc>
           <w:tcPr>
-            <w:tcW w:type="dxa" w:w="2880"/>
+            <w:tcW w:type="dxa" w:w="2835"/>
           </w:tcPr>
           <w:p>
             <w:r>
@@ -339,7 +379,7 @@
         </w:tc>
         <w:tc>
           <w:tcPr>
-            <w:tcW w:type="dxa" w:w="2880"/>
+            <w:tcW w:type="dxa" w:w="1134"/>
           </w:tcPr>
           <w:p>
             <w:r>
@@ -352,7 +392,7 @@
         </w:tc>
         <w:tc>
           <w:tcPr>
-            <w:tcW w:type="dxa" w:w="2880"/>
+            <w:tcW w:type="dxa" w:w="5669"/>
           </w:tcPr>
           <w:p>
             <w:r>
@@ -367,7 +407,7 @@
       <w:tr>
         <w:tc>
           <w:tcPr>
-            <w:tcW w:type="dxa" w:w="2880"/>
+            <w:tcW w:type="dxa" w:w="2835"/>
           </w:tcPr>
           <w:p>
             <w:r>
@@ -377,7 +417,7 @@
         </w:tc>
         <w:tc>
           <w:tcPr>
-            <w:tcW w:type="dxa" w:w="2880"/>
+            <w:tcW w:type="dxa" w:w="1134"/>
           </w:tcPr>
           <w:p>
             <w:r>
@@ -387,7 +427,7 @@
         </w:tc>
         <w:tc>
           <w:tcPr>
-            <w:tcW w:type="dxa" w:w="2880"/>
+            <w:tcW w:type="dxa" w:w="5669"/>
           </w:tcPr>
           <w:p>
             <w:r>
@@ -399,7 +439,7 @@
       <w:tr>
         <w:tc>
           <w:tcPr>
-            <w:tcW w:type="dxa" w:w="2880"/>
+            <w:tcW w:type="dxa" w:w="2835"/>
           </w:tcPr>
           <w:p>
             <w:r>
@@ -409,7 +449,7 @@
         </w:tc>
         <w:tc>
           <w:tcPr>
-            <w:tcW w:type="dxa" w:w="2880"/>
+            <w:tcW w:type="dxa" w:w="1134"/>
           </w:tcPr>
           <w:p>
             <w:r>
@@ -419,7 +459,7 @@
         </w:tc>
         <w:tc>
           <w:tcPr>
-            <w:tcW w:type="dxa" w:w="2880"/>
+            <w:tcW w:type="dxa" w:w="5669"/>
           </w:tcPr>
           <w:p>
             <w:r>
@@ -476,6 +516,7 @@
       <w:tblPr>
         <w:tblStyle w:val="LightGrid-Accent1"/>
         <w:tblW w:type="auto" w:w="0"/>
+        <w:tblLayout w:type="fixed"/>
         <w:tblLook w:firstColumn="1" w:firstRow="1" w:lastColumn="0" w:lastRow="0" w:noHBand="0" w:noVBand="1" w:val="04A0"/>
       </w:tblPr>
       <w:tblGrid>
@@ -486,7 +527,7 @@
       <w:tr>
         <w:tc>
           <w:tcPr>
-            <w:tcW w:type="dxa" w:w="2880"/>
+            <w:tcW w:type="dxa" w:w="2835"/>
           </w:tcPr>
           <w:p>
             <w:r>
@@ -499,7 +540,7 @@
         </w:tc>
         <w:tc>
           <w:tcPr>
-            <w:tcW w:type="dxa" w:w="2880"/>
+            <w:tcW w:type="dxa" w:w="1134"/>
           </w:tcPr>
           <w:p>
             <w:r>
@@ -512,7 +553,7 @@
         </w:tc>
         <w:tc>
           <w:tcPr>
-            <w:tcW w:type="dxa" w:w="2880"/>
+            <w:tcW w:type="dxa" w:w="5669"/>
           </w:tcPr>
           <w:p>
             <w:r>
@@ -527,7 +568,7 @@
       <w:tr>
         <w:tc>
           <w:tcPr>
-            <w:tcW w:type="dxa" w:w="2880"/>
+            <w:tcW w:type="dxa" w:w="2835"/>
           </w:tcPr>
           <w:p>
             <w:r>
@@ -537,7 +578,7 @@
         </w:tc>
         <w:tc>
           <w:tcPr>
-            <w:tcW w:type="dxa" w:w="2880"/>
+            <w:tcW w:type="dxa" w:w="1134"/>
           </w:tcPr>
           <w:p>
             <w:r>
@@ -547,7 +588,7 @@
         </w:tc>
         <w:tc>
           <w:tcPr>
-            <w:tcW w:type="dxa" w:w="2880"/>
+            <w:tcW w:type="dxa" w:w="5669"/>
           </w:tcPr>
           <w:p>
             <w:r>
@@ -559,7 +600,7 @@
       <w:tr>
         <w:tc>
           <w:tcPr>
-            <w:tcW w:type="dxa" w:w="2880"/>
+            <w:tcW w:type="dxa" w:w="2835"/>
           </w:tcPr>
           <w:p>
             <w:r>
@@ -569,7 +610,7 @@
         </w:tc>
         <w:tc>
           <w:tcPr>
-            <w:tcW w:type="dxa" w:w="2880"/>
+            <w:tcW w:type="dxa" w:w="1134"/>
           </w:tcPr>
           <w:p>
             <w:r>
@@ -579,7 +620,7 @@
         </w:tc>
         <w:tc>
           <w:tcPr>
-            <w:tcW w:type="dxa" w:w="2880"/>
+            <w:tcW w:type="dxa" w:w="5669"/>
           </w:tcPr>
           <w:p>
             <w:r>
@@ -591,7 +632,7 @@
       <w:tr>
         <w:tc>
           <w:tcPr>
-            <w:tcW w:type="dxa" w:w="2880"/>
+            <w:tcW w:type="dxa" w:w="2835"/>
           </w:tcPr>
           <w:p>
             <w:r>
@@ -601,7 +642,7 @@
         </w:tc>
         <w:tc>
           <w:tcPr>
-            <w:tcW w:type="dxa" w:w="2880"/>
+            <w:tcW w:type="dxa" w:w="1134"/>
           </w:tcPr>
           <w:p>
             <w:r>
@@ -611,7 +652,7 @@
         </w:tc>
         <w:tc>
           <w:tcPr>
-            <w:tcW w:type="dxa" w:w="2880"/>
+            <w:tcW w:type="dxa" w:w="5669"/>
           </w:tcPr>
           <w:p>
             <w:r>
@@ -644,6 +685,7 @@
       <w:tblPr>
         <w:tblStyle w:val="LightGrid-Accent1"/>
         <w:tblW w:type="auto" w:w="0"/>
+        <w:tblLayout w:type="fixed"/>
         <w:tblLook w:firstColumn="1" w:firstRow="1" w:lastColumn="0" w:lastRow="0" w:noHBand="0" w:noVBand="1" w:val="04A0"/>
       </w:tblPr>
       <w:tblGrid>
@@ -654,7 +696,7 @@
       <w:tr>
         <w:tc>
           <w:tcPr>
-            <w:tcW w:type="dxa" w:w="2880"/>
+            <w:tcW w:type="dxa" w:w="2835"/>
           </w:tcPr>
           <w:p>
             <w:r>
@@ -667,7 +709,7 @@
         </w:tc>
         <w:tc>
           <w:tcPr>
-            <w:tcW w:type="dxa" w:w="2880"/>
+            <w:tcW w:type="dxa" w:w="1134"/>
           </w:tcPr>
           <w:p>
             <w:r>
@@ -680,7 +722,7 @@
         </w:tc>
         <w:tc>
           <w:tcPr>
-            <w:tcW w:type="dxa" w:w="2880"/>
+            <w:tcW w:type="dxa" w:w="5669"/>
           </w:tcPr>
           <w:p>
             <w:r>
@@ -695,7 +737,7 @@
       <w:tr>
         <w:tc>
           <w:tcPr>
-            <w:tcW w:type="dxa" w:w="2880"/>
+            <w:tcW w:type="dxa" w:w="2835"/>
           </w:tcPr>
           <w:p>
             <w:r>
@@ -705,7 +747,7 @@
         </w:tc>
         <w:tc>
           <w:tcPr>
-            <w:tcW w:type="dxa" w:w="2880"/>
+            <w:tcW w:type="dxa" w:w="1134"/>
           </w:tcPr>
           <w:p>
             <w:r>
@@ -715,7 +757,7 @@
         </w:tc>
         <w:tc>
           <w:tcPr>
-            <w:tcW w:type="dxa" w:w="2880"/>
+            <w:tcW w:type="dxa" w:w="5669"/>
           </w:tcPr>
           <w:p>
             <w:r>
@@ -727,7 +769,7 @@
       <w:tr>
         <w:tc>
           <w:tcPr>
-            <w:tcW w:type="dxa" w:w="2880"/>
+            <w:tcW w:type="dxa" w:w="2835"/>
           </w:tcPr>
           <w:p>
             <w:r>
@@ -737,7 +779,7 @@
         </w:tc>
         <w:tc>
           <w:tcPr>
-            <w:tcW w:type="dxa" w:w="2880"/>
+            <w:tcW w:type="dxa" w:w="1134"/>
           </w:tcPr>
           <w:p>
             <w:r>
@@ -747,7 +789,7 @@
         </w:tc>
         <w:tc>
           <w:tcPr>
-            <w:tcW w:type="dxa" w:w="2880"/>
+            <w:tcW w:type="dxa" w:w="5669"/>
           </w:tcPr>
           <w:p>
             <w:r>
@@ -759,7 +801,7 @@
       <w:tr>
         <w:tc>
           <w:tcPr>
-            <w:tcW w:type="dxa" w:w="2880"/>
+            <w:tcW w:type="dxa" w:w="2835"/>
           </w:tcPr>
           <w:p>
             <w:r>
@@ -769,7 +811,7 @@
         </w:tc>
         <w:tc>
           <w:tcPr>
-            <w:tcW w:type="dxa" w:w="2880"/>
+            <w:tcW w:type="dxa" w:w="1134"/>
           </w:tcPr>
           <w:p>
             <w:r>
@@ -779,7 +821,7 @@
         </w:tc>
         <w:tc>
           <w:tcPr>
-            <w:tcW w:type="dxa" w:w="2880"/>
+            <w:tcW w:type="dxa" w:w="5669"/>
           </w:tcPr>
           <w:p>
             <w:r>
@@ -807,6 +849,7 @@
       <w:tblPr>
         <w:tblStyle w:val="LightGrid-Accent1"/>
         <w:tblW w:type="auto" w:w="0"/>
+        <w:tblLayout w:type="fixed"/>
         <w:tblLook w:firstColumn="1" w:firstRow="1" w:lastColumn="0" w:lastRow="0" w:noHBand="0" w:noVBand="1" w:val="04A0"/>
       </w:tblPr>
       <w:tblGrid>
@@ -817,7 +860,7 @@
       <w:tr>
         <w:tc>
           <w:tcPr>
-            <w:tcW w:type="dxa" w:w="2880"/>
+            <w:tcW w:type="dxa" w:w="2835"/>
           </w:tcPr>
           <w:p>
             <w:r>
@@ -830,7 +873,7 @@
         </w:tc>
         <w:tc>
           <w:tcPr>
-            <w:tcW w:type="dxa" w:w="2880"/>
+            <w:tcW w:type="dxa" w:w="1134"/>
           </w:tcPr>
           <w:p>
             <w:r>
@@ -843,7 +886,7 @@
         </w:tc>
         <w:tc>
           <w:tcPr>
-            <w:tcW w:type="dxa" w:w="2880"/>
+            <w:tcW w:type="dxa" w:w="5669"/>
           </w:tcPr>
           <w:p>
             <w:r>
@@ -858,7 +901,7 @@
       <w:tr>
         <w:tc>
           <w:tcPr>
-            <w:tcW w:type="dxa" w:w="2880"/>
+            <w:tcW w:type="dxa" w:w="2835"/>
           </w:tcPr>
           <w:p>
             <w:r>
@@ -868,7 +911,7 @@
         </w:tc>
         <w:tc>
           <w:tcPr>
-            <w:tcW w:type="dxa" w:w="2880"/>
+            <w:tcW w:type="dxa" w:w="1134"/>
           </w:tcPr>
           <w:p>
             <w:r>
@@ -878,7 +921,7 @@
         </w:tc>
         <w:tc>
           <w:tcPr>
-            <w:tcW w:type="dxa" w:w="2880"/>
+            <w:tcW w:type="dxa" w:w="5669"/>
           </w:tcPr>
           <w:p>
             <w:r>
@@ -890,7 +933,7 @@
       <w:tr>
         <w:tc>
           <w:tcPr>
-            <w:tcW w:type="dxa" w:w="2880"/>
+            <w:tcW w:type="dxa" w:w="2835"/>
           </w:tcPr>
           <w:p>
             <w:r>
@@ -900,7 +943,7 @@
         </w:tc>
         <w:tc>
           <w:tcPr>
-            <w:tcW w:type="dxa" w:w="2880"/>
+            <w:tcW w:type="dxa" w:w="1134"/>
           </w:tcPr>
           <w:p>
             <w:r>
@@ -910,7 +953,7 @@
         </w:tc>
         <w:tc>
           <w:tcPr>
-            <w:tcW w:type="dxa" w:w="2880"/>
+            <w:tcW w:type="dxa" w:w="5669"/>
           </w:tcPr>
           <w:p>
             <w:r>
@@ -922,7 +965,7 @@
       <w:tr>
         <w:tc>
           <w:tcPr>
-            <w:tcW w:type="dxa" w:w="2880"/>
+            <w:tcW w:type="dxa" w:w="2835"/>
           </w:tcPr>
           <w:p>
             <w:r>
@@ -932,7 +975,7 @@
         </w:tc>
         <w:tc>
           <w:tcPr>
-            <w:tcW w:type="dxa" w:w="2880"/>
+            <w:tcW w:type="dxa" w:w="1134"/>
           </w:tcPr>
           <w:p>
             <w:r>
@@ -942,7 +985,7 @@
         </w:tc>
         <w:tc>
           <w:tcPr>
-            <w:tcW w:type="dxa" w:w="2880"/>
+            <w:tcW w:type="dxa" w:w="5669"/>
           </w:tcPr>
           <w:p>
             <w:r>
@@ -954,7 +997,7 @@
       <w:tr>
         <w:tc>
           <w:tcPr>
-            <w:tcW w:type="dxa" w:w="2880"/>
+            <w:tcW w:type="dxa" w:w="2835"/>
           </w:tcPr>
           <w:p>
             <w:r>
@@ -964,7 +1007,7 @@
         </w:tc>
         <w:tc>
           <w:tcPr>
-            <w:tcW w:type="dxa" w:w="2880"/>
+            <w:tcW w:type="dxa" w:w="1134"/>
           </w:tcPr>
           <w:p>
             <w:r>
@@ -974,7 +1017,7 @@
         </w:tc>
         <w:tc>
           <w:tcPr>
-            <w:tcW w:type="dxa" w:w="2880"/>
+            <w:tcW w:type="dxa" w:w="5669"/>
           </w:tcPr>
           <w:p>
             <w:r>
@@ -986,7 +1029,7 @@
       <w:tr>
         <w:tc>
           <w:tcPr>
-            <w:tcW w:type="dxa" w:w="2880"/>
+            <w:tcW w:type="dxa" w:w="2835"/>
           </w:tcPr>
           <w:p>
             <w:r>
@@ -996,7 +1039,7 @@
         </w:tc>
         <w:tc>
           <w:tcPr>
-            <w:tcW w:type="dxa" w:w="2880"/>
+            <w:tcW w:type="dxa" w:w="1134"/>
           </w:tcPr>
           <w:p>
             <w:r>
@@ -1006,7 +1049,7 @@
         </w:tc>
         <w:tc>
           <w:tcPr>
-            <w:tcW w:type="dxa" w:w="2880"/>
+            <w:tcW w:type="dxa" w:w="5669"/>
           </w:tcPr>
           <w:p>
             <w:r>
@@ -1018,7 +1061,7 @@
       <w:tr>
         <w:tc>
           <w:tcPr>
-            <w:tcW w:type="dxa" w:w="2880"/>
+            <w:tcW w:type="dxa" w:w="2835"/>
           </w:tcPr>
           <w:p>
             <w:r>
@@ -1028,7 +1071,7 @@
         </w:tc>
         <w:tc>
           <w:tcPr>
-            <w:tcW w:type="dxa" w:w="2880"/>
+            <w:tcW w:type="dxa" w:w="1134"/>
           </w:tcPr>
           <w:p>
             <w:r>
@@ -1038,7 +1081,7 @@
         </w:tc>
         <w:tc>
           <w:tcPr>
-            <w:tcW w:type="dxa" w:w="2880"/>
+            <w:tcW w:type="dxa" w:w="5669"/>
           </w:tcPr>
           <w:p>
             <w:r>
@@ -1075,6 +1118,266 @@
         <w:t>点击「上传原始出单数据」或使用示例数据。必需列：源SKU、SPU、室内外、一级分类、年、月、美西、美东、美南GA、美南TX。</w:t>
       </w:r>
     </w:p>
+    <w:p>
+      <w:r>
+        <w:t>数据格式示例：</w:t>
+      </w:r>
+    </w:p>
+    <w:tbl>
+      <w:tblPr>
+        <w:tblStyle w:val="LightGrid-Accent1"/>
+        <w:tblW w:type="auto" w:w="0"/>
+        <w:tblLayout w:type="fixed"/>
+        <w:tblLook w:firstColumn="1" w:firstRow="1" w:lastColumn="0" w:lastRow="0" w:noHBand="0" w:noVBand="1" w:val="04A0"/>
+      </w:tblPr>
+      <w:tblGrid>
+        <w:gridCol w:w="864"/>
+        <w:gridCol w:w="864"/>
+        <w:gridCol w:w="864"/>
+        <w:gridCol w:w="864"/>
+        <w:gridCol w:w="864"/>
+        <w:gridCol w:w="864"/>
+        <w:gridCol w:w="864"/>
+        <w:gridCol w:w="864"/>
+        <w:gridCol w:w="864"/>
+        <w:gridCol w:w="864"/>
+      </w:tblGrid>
+      <w:tr>
+        <w:tc>
+          <w:tcPr>
+            <w:tcW w:type="dxa" w:w="1984"/>
+          </w:tcPr>
+          <w:p>
+            <w:r>
+              <w:rPr>
+                <w:b/>
+              </w:rPr>
+              <w:t>源SKU</w:t>
+            </w:r>
+          </w:p>
+        </w:tc>
+        <w:tc>
+          <w:tcPr>
+            <w:tcW w:type="dxa" w:w="1701"/>
+          </w:tcPr>
+          <w:p>
+            <w:r>
+              <w:rPr>
+                <w:b/>
+              </w:rPr>
+              <w:t>SPU</w:t>
+            </w:r>
+          </w:p>
+        </w:tc>
+        <w:tc>
+          <w:tcPr>
+            <w:tcW w:type="dxa" w:w="850"/>
+          </w:tcPr>
+          <w:p>
+            <w:r>
+              <w:rPr>
+                <w:b/>
+              </w:rPr>
+              <w:t>室内外</w:t>
+            </w:r>
+          </w:p>
+        </w:tc>
+        <w:tc>
+          <w:tcPr>
+            <w:tcW w:type="dxa" w:w="850"/>
+          </w:tcPr>
+          <w:p>
+            <w:r>
+              <w:rPr>
+                <w:b/>
+              </w:rPr>
+              <w:t>一级分类</w:t>
+            </w:r>
+          </w:p>
+        </w:tc>
+        <w:tc>
+          <w:tcPr>
+            <w:tcW w:type="dxa" w:w="567"/>
+          </w:tcPr>
+          <w:p>
+            <w:r>
+              <w:rPr>
+                <w:b/>
+              </w:rPr>
+              <w:t>年</w:t>
+            </w:r>
+          </w:p>
+        </w:tc>
+        <w:tc>
+          <w:tcPr>
+            <w:tcW w:type="dxa" w:w="567"/>
+          </w:tcPr>
+          <w:p>
+            <w:r>
+              <w:rPr>
+                <w:b/>
+              </w:rPr>
+              <w:t>月</w:t>
+            </w:r>
+          </w:p>
+        </w:tc>
+        <w:tc>
+          <w:tcPr>
+            <w:tcW w:type="dxa" w:w="567"/>
+          </w:tcPr>
+          <w:p>
+            <w:r>
+              <w:rPr>
+                <w:b/>
+              </w:rPr>
+              <w:t>美西</w:t>
+            </w:r>
+          </w:p>
+        </w:tc>
+        <w:tc>
+          <w:tcPr>
+            <w:tcW w:type="dxa" w:w="567"/>
+          </w:tcPr>
+          <w:p>
+            <w:r>
+              <w:rPr>
+                <w:b/>
+              </w:rPr>
+              <w:t>美东</w:t>
+            </w:r>
+          </w:p>
+        </w:tc>
+        <w:tc>
+          <w:tcPr>
+            <w:tcW w:type="dxa" w:w="850"/>
+          </w:tcPr>
+          <w:p>
+            <w:r>
+              <w:rPr>
+                <w:b/>
+              </w:rPr>
+              <w:t>美南GA</w:t>
+            </w:r>
+          </w:p>
+        </w:tc>
+        <w:tc>
+          <w:tcPr>
+            <w:tcW w:type="dxa" w:w="850"/>
+          </w:tcPr>
+          <w:p>
+            <w:r>
+              <w:rPr>
+                <w:b/>
+              </w:rPr>
+              <w:t>美南TX</w:t>
+            </w:r>
+          </w:p>
+        </w:tc>
+      </w:tr>
+      <w:tr>
+        <w:tc>
+          <w:tcPr>
+            <w:tcW w:type="dxa" w:w="1984"/>
+          </w:tcPr>
+          <w:p>
+            <w:r>
+              <w:t>NBGF050BROOS-V4</w:t>
+            </w:r>
+          </w:p>
+        </w:tc>
+        <w:tc>
+          <w:tcPr>
+            <w:tcW w:type="dxa" w:w="1701"/>
+          </w:tcPr>
+          <w:p>
+            <w:r>
+              <w:t>NBGF050BROOS</w:t>
+            </w:r>
+          </w:p>
+        </w:tc>
+        <w:tc>
+          <w:tcPr>
+            <w:tcW w:type="dxa" w:w="850"/>
+          </w:tcPr>
+          <w:p>
+            <w:r>
+              <w:t>室内</w:t>
+            </w:r>
+          </w:p>
+        </w:tc>
+        <w:tc>
+          <w:tcPr>
+            <w:tcW w:type="dxa" w:w="850"/>
+          </w:tcPr>
+          <w:p>
+            <w:r>
+              <w:t>庭院</w:t>
+            </w:r>
+          </w:p>
+        </w:tc>
+        <w:tc>
+          <w:tcPr>
+            <w:tcW w:type="dxa" w:w="567"/>
+          </w:tcPr>
+          <w:p>
+            <w:r>
+              <w:t>2026</w:t>
+            </w:r>
+          </w:p>
+        </w:tc>
+        <w:tc>
+          <w:tcPr>
+            <w:tcW w:type="dxa" w:w="567"/>
+          </w:tcPr>
+          <w:p>
+            <w:r>
+              <w:t>5</w:t>
+            </w:r>
+          </w:p>
+        </w:tc>
+        <w:tc>
+          <w:tcPr>
+            <w:tcW w:type="dxa" w:w="567"/>
+          </w:tcPr>
+          <w:p>
+            <w:r>
+              <w:t>12</w:t>
+            </w:r>
+          </w:p>
+        </w:tc>
+        <w:tc>
+          <w:tcPr>
+            <w:tcW w:type="dxa" w:w="567"/>
+          </w:tcPr>
+          <w:p>
+            <w:r>
+              <w:t>8</w:t>
+            </w:r>
+          </w:p>
+        </w:tc>
+        <w:tc>
+          <w:tcPr>
+            <w:tcW w:type="dxa" w:w="850"/>
+          </w:tcPr>
+          <w:p>
+            <w:r>
+              <w:t>3</w:t>
+            </w:r>
+          </w:p>
+        </w:tc>
+        <w:tc>
+          <w:tcPr>
+            <w:tcW w:type="dxa" w:w="850"/>
+          </w:tcPr>
+          <w:p>
+            <w:r>
+              <w:t>2</w:t>
+            </w:r>
+          </w:p>
+        </w:tc>
+      </w:tr>
+    </w:tbl>
+    <w:p/>
     <w:p>
       <w:r>
         <w:t>上传后可展开「数据体检 + 预览」查看总行数、SKU数、品类数、时间跨度。</w:t>
@@ -1353,6 +1656,7 @@
       <w:tblPr>
         <w:tblStyle w:val="LightGrid-Accent1"/>
         <w:tblW w:type="auto" w:w="0"/>
+        <w:tblLayout w:type="fixed"/>
         <w:tblLook w:firstColumn="1" w:firstRow="1" w:lastColumn="0" w:lastRow="0" w:noHBand="0" w:noVBand="1" w:val="04A0"/>
       </w:tblPr>
       <w:tblGrid>
@@ -1363,7 +1667,7 @@
       <w:tr>
         <w:tc>
           <w:tcPr>
-            <w:tcW w:type="dxa" w:w="2880"/>
+            <w:tcW w:type="dxa" w:w="1134"/>
           </w:tcPr>
           <w:p>
             <w:r>
@@ -1376,7 +1680,7 @@
         </w:tc>
         <w:tc>
           <w:tcPr>
-            <w:tcW w:type="dxa" w:w="2880"/>
+            <w:tcW w:type="dxa" w:w="2268"/>
           </w:tcPr>
           <w:p>
             <w:r>
@@ -1389,7 +1693,7 @@
         </w:tc>
         <w:tc>
           <w:tcPr>
-            <w:tcW w:type="dxa" w:w="2880"/>
+            <w:tcW w:type="dxa" w:w="6236"/>
           </w:tcPr>
           <w:p>
             <w:r>
@@ -1404,7 +1708,7 @@
       <w:tr>
         <w:tc>
           <w:tcPr>
-            <w:tcW w:type="dxa" w:w="2880"/>
+            <w:tcW w:type="dxa" w:w="1134"/>
           </w:tcPr>
           <w:p>
             <w:r>
@@ -1414,7 +1718,7 @@
         </w:tc>
         <w:tc>
           <w:tcPr>
-            <w:tcW w:type="dxa" w:w="2880"/>
+            <w:tcW w:type="dxa" w:w="2268"/>
           </w:tcPr>
           <w:p>
             <w:r>
@@ -1424,7 +1728,7 @@
         </w:tc>
         <w:tc>
           <w:tcPr>
-            <w:tcW w:type="dxa" w:w="2880"/>
+            <w:tcW w:type="dxa" w:w="6236"/>
           </w:tcPr>
           <w:p>
             <w:r>
@@ -1436,7 +1740,7 @@
       <w:tr>
         <w:tc>
           <w:tcPr>
-            <w:tcW w:type="dxa" w:w="2880"/>
+            <w:tcW w:type="dxa" w:w="1134"/>
           </w:tcPr>
           <w:p>
             <w:r>
@@ -1446,7 +1750,7 @@
         </w:tc>
         <w:tc>
           <w:tcPr>
-            <w:tcW w:type="dxa" w:w="2880"/>
+            <w:tcW w:type="dxa" w:w="2268"/>
           </w:tcPr>
           <w:p>
             <w:r>
@@ -1456,7 +1760,7 @@
         </w:tc>
         <w:tc>
           <w:tcPr>
-            <w:tcW w:type="dxa" w:w="2880"/>
+            <w:tcW w:type="dxa" w:w="6236"/>
           </w:tcPr>
           <w:p>
             <w:r>
@@ -1468,7 +1772,7 @@
       <w:tr>
         <w:tc>
           <w:tcPr>
-            <w:tcW w:type="dxa" w:w="2880"/>
+            <w:tcW w:type="dxa" w:w="1134"/>
           </w:tcPr>
           <w:p>
             <w:r>
@@ -1478,7 +1782,7 @@
         </w:tc>
         <w:tc>
           <w:tcPr>
-            <w:tcW w:type="dxa" w:w="2880"/>
+            <w:tcW w:type="dxa" w:w="2268"/>
           </w:tcPr>
           <w:p>
             <w:r>
@@ -1488,7 +1792,7 @@
         </w:tc>
         <w:tc>
           <w:tcPr>
-            <w:tcW w:type="dxa" w:w="2880"/>
+            <w:tcW w:type="dxa" w:w="6236"/>
           </w:tcPr>
           <w:p>
             <w:r>
@@ -1500,7 +1804,7 @@
       <w:tr>
         <w:tc>
           <w:tcPr>
-            <w:tcW w:type="dxa" w:w="2880"/>
+            <w:tcW w:type="dxa" w:w="1134"/>
           </w:tcPr>
           <w:p>
             <w:r>
@@ -1510,7 +1814,7 @@
         </w:tc>
         <w:tc>
           <w:tcPr>
-            <w:tcW w:type="dxa" w:w="2880"/>
+            <w:tcW w:type="dxa" w:w="2268"/>
           </w:tcPr>
           <w:p>
             <w:r>
@@ -1520,7 +1824,7 @@
         </w:tc>
         <w:tc>
           <w:tcPr>
-            <w:tcW w:type="dxa" w:w="2880"/>
+            <w:tcW w:type="dxa" w:w="6236"/>
           </w:tcPr>
           <w:p>
             <w:r>
@@ -1532,7 +1836,7 @@
       <w:tr>
         <w:tc>
           <w:tcPr>
-            <w:tcW w:type="dxa" w:w="2880"/>
+            <w:tcW w:type="dxa" w:w="1134"/>
           </w:tcPr>
           <w:p>
             <w:r>
@@ -1542,7 +1846,7 @@
         </w:tc>
         <w:tc>
           <w:tcPr>
-            <w:tcW w:type="dxa" w:w="2880"/>
+            <w:tcW w:type="dxa" w:w="2268"/>
           </w:tcPr>
           <w:p>
             <w:r>
@@ -1552,7 +1856,7 @@
         </w:tc>
         <w:tc>
           <w:tcPr>
-            <w:tcW w:type="dxa" w:w="2880"/>
+            <w:tcW w:type="dxa" w:w="6236"/>
           </w:tcPr>
           <w:p>
             <w:r>
@@ -1564,7 +1868,7 @@
       <w:tr>
         <w:tc>
           <w:tcPr>
-            <w:tcW w:type="dxa" w:w="2880"/>
+            <w:tcW w:type="dxa" w:w="1134"/>
           </w:tcPr>
           <w:p>
             <w:r>
@@ -1574,7 +1878,7 @@
         </w:tc>
         <w:tc>
           <w:tcPr>
-            <w:tcW w:type="dxa" w:w="2880"/>
+            <w:tcW w:type="dxa" w:w="2268"/>
           </w:tcPr>
           <w:p>
             <w:r>
@@ -1584,7 +1888,7 @@
         </w:tc>
         <w:tc>
           <w:tcPr>
-            <w:tcW w:type="dxa" w:w="2880"/>
+            <w:tcW w:type="dxa" w:w="6236"/>
           </w:tcPr>
           <w:p>
             <w:r>
@@ -1596,7 +1900,7 @@
       <w:tr>
         <w:tc>
           <w:tcPr>
-            <w:tcW w:type="dxa" w:w="2880"/>
+            <w:tcW w:type="dxa" w:w="1134"/>
           </w:tcPr>
           <w:p>
             <w:r>
@@ -1606,7 +1910,7 @@
         </w:tc>
         <w:tc>
           <w:tcPr>
-            <w:tcW w:type="dxa" w:w="2880"/>
+            <w:tcW w:type="dxa" w:w="2268"/>
           </w:tcPr>
           <w:p>
             <w:r>
@@ -1616,7 +1920,7 @@
         </w:tc>
         <w:tc>
           <w:tcPr>
-            <w:tcW w:type="dxa" w:w="2880"/>
+            <w:tcW w:type="dxa" w:w="6236"/>
           </w:tcPr>
           <w:p>
             <w:r>
@@ -1694,12 +1998,12 @@
         <w:pStyle w:val="Heading2"/>
       </w:pPr>
       <w:r>
-        <w:t>Q: 目标期设定为 5月，趋势因子参考哪些时间？</w:t>
+        <w:t>Q1：目标期设定为 5月，趋势因子参考哪些时间？</w:t>
       </w:r>
     </w:p>
     <w:p>
       <w:r>
-        <w:t>A: 趋势因子比较去年同期（2026年5月）与前年同期（2025年5月）的原始单量占比差。多月目标期（如4-6月）则参考4-6月。</w:t>
+        <w:t>A：趋势因子比较去年同期（2026年5月）与前年同期（2025年5月）的原始单量占比差。多月目标期（如4-6月）则参考4-6月。</w:t>
       </w:r>
     </w:p>
     <w:p>
@@ -1707,12 +2011,12 @@
         <w:pStyle w:val="Heading2"/>
       </w:pPr>
       <w:r>
-        <w:t>Q: 强季节和弱季节品类怎么区分？</w:t>
+        <w:t>Q2：强季节和弱季节品类怎么区分？</w:t>
       </w:r>
     </w:p>
     <w:p>
       <w:r>
-        <w:t>A: 强季节品类 = 侧边栏「季节适用品类」多选框中勾选的品类（默认庭院类）。不在列表中的品类自动归为弱季节。</w:t>
+        <w:t>A：强季节品类 = 侧边栏「季节适用品类」多选框中勾选的品类（默认庭院类）。不在列表中的品类自动归为弱季节。</w:t>
       </w:r>
     </w:p>
     <w:p>
@@ -1720,12 +2024,12 @@
         <w:pStyle w:val="Heading2"/>
       </w:pPr>
       <w:r>
-        <w:t>Q: 同月跨年衰减率 λ_same 和非同月衰减率 λ 有什么区别？</w:t>
+        <w:t>Q3：同月跨年衰减率 λ_same 和非同月衰减率 λ 有什么区别？</w:t>
       </w:r>
     </w:p>
     <w:p>
       <w:r>
-        <w:t>A: λ_same（0.95）用于同月数据跨年衰减，去年同月保留95%，前年同月保留90%。λ（0.85）用于弱季节品类的非同月数据衰减，1个月前85%，6个月前38%。同月数据参考价值更高，所以衰减更慢。</w:t>
+        <w:t>A：λ_same（0.95）用于同月数据跨年衰减，去年同月保留95%，前年同月保留90%。λ（0.85）用于弱季节品类的非同月数据衰减，1个月前85%，6个月前38%。同月数据参考价值更高，所以衰减更慢。</w:t>
       </w:r>
     </w:p>
     <w:p>
@@ -1733,12 +2037,12 @@
         <w:pStyle w:val="Heading2"/>
       </w:pPr>
       <w:r>
-        <w:t>Q: 新品怎么判定？</w:t>
+        <w:t>Q4：新品怎么判定？</w:t>
       </w:r>
     </w:p>
     <w:p>
       <w:r>
-        <w:t>A: 历史出单月数 ≤ 2 或 目标期总单量 &lt; 10，满足任一即视为新品。新品自身权重=0，完全使用基准占比（从 SPU 到全公司逐级回退）。</w:t>
+        <w:t>A：历史出单月数 ≤ 2 或 目标期总单量 &lt; 10，满足任一即视为新品。新品自身权重=0，完全使用基准占比（从 SPU 到全公司逐级回退）。</w:t>
       </w:r>
     </w:p>
     <w:p>
@@ -1746,12 +2050,12 @@
         <w:pStyle w:val="Heading2"/>
       </w:pPr>
       <w:r>
-        <w:t>Q: 减仓优化影响上层聚合吗？</w:t>
+        <w:t>Q5：减仓优化影响上层聚合吗？</w:t>
       </w:r>
     </w:p>
     <w:p>
       <w:r>
-        <w:t>A: 不影响。减仓仅修改 SKU 层的「调整后」列，一级分类/室内外/SPU/全公司的聚合使用减仓前的原始数据。</w:t>
+        <w:t>A：不影响。减仓仅修改 SKU 层的「调整后」列，一级分类/室内外/SPU/全公司的聚合使用减仓前的原始数据。</w:t>
       </w:r>
     </w:p>
     <w:p>
@@ -1759,12 +2063,12 @@
         <w:pStyle w:val="Heading2"/>
       </w:pPr>
       <w:r>
-        <w:t>Q: 四仓占比一定等于100%吗？</w:t>
+        <w:t>Q6：四仓占比一定等于100%吗？</w:t>
       </w:r>
     </w:p>
     <w:p>
       <w:r>
-        <w:t>A: 是的。引擎计算后自动归一化，趋势调整后再次归一化，微调时自动补足，自检验证偏差 &lt; 1e-9。</w:t>
+        <w:t>A：是的。引擎计算后自动归一化，趋势调整后再次归一化，微调时自动补足，自检验证偏差 &lt; 1e-9。</w:t>
       </w:r>
     </w:p>
     <w:p>
@@ -1772,15 +2076,17 @@
         <w:pStyle w:val="Heading2"/>
       </w:pPr>
       <w:r>
-        <w:t>Q: 趋势因子和季节因子会冲突吗？</w:t>
+        <w:t>Q7：趋势因子和季节因子会冲突吗？</w:t>
       </w:r>
     </w:p>
     <w:p>
       <w:r>
-        <w:t>A: 不会。季节因子作用于加权层（步骤3），趋势因子作用于最终占比层（步骤6），两者作用层不同。趋势因子用原始数据计算，不受衰减和季节因子干扰。</w:t>
+        <w:t>A：不会。季节因子作用于加权层（步骤3），趋势因子作用于最终占比层（步骤6），两者作用层不同。趋势因子用原始数据计算，不受衰减和季节因子干扰。</w:t>
       </w:r>
     </w:p>
     <w:sectPr>
+      <w:headerReference w:type="default" r:id="rId9"/>
+      <w:footerReference w:type="default" r:id="rId10"/>
       <w:pgSz w:w="12240" w:h="15840"/>
       <w:pgMar w:top="1440" w:right="1800" w:bottom="1440" w:left="1800" w:header="720" w:footer="720" w:gutter="0"/>
       <w:cols w:space="720"/>
@@ -1788,6 +2094,74 @@
     </w:sectPr>
   </w:body>
 </w:document>
+</file>
+
+<file path=word/footer1.xml><?xml version="1.0" encoding="utf-8"?>
+<w:ftr xmlns:m="http://schemas.openxmlformats.org/officeDocument/2006/math" xmlns:mc="http://schemas.openxmlformats.org/markup-compatibility/2006" xmlns:mo="http://schemas.microsoft.com/office/mac/office/2008/main" xmlns:mv="urn:schemas-microsoft-com:mac:vml" xmlns:o="urn:schemas-microsoft-com:office:office" xmlns:r="http://schemas.openxmlformats.org/officeDocument/2006/relationships" xmlns:v="urn:schemas-microsoft-com:vml" xmlns:w10="urn:schemas-microsoft-com:office:word" xmlns:w14="http://schemas.microsoft.com/office/word/2010/wordml" xmlns:w="http://schemas.openxmlformats.org/wordprocessingml/2006/main" xmlns:wne="http://schemas.microsoft.com/office/word/2006/wordml" xmlns:wp14="http://schemas.microsoft.com/office/word/2010/wordprocessingDrawing" xmlns:wp="http://schemas.openxmlformats.org/drawingml/2006/wordprocessingDrawing" xmlns:wpc="http://schemas.microsoft.com/office/word/2010/wordprocessingCanvas" xmlns:wpg="http://schemas.microsoft.com/office/word/2010/wordprocessingGroup" xmlns:wpi="http://schemas.microsoft.com/office/word/2010/wordprocessingInk" xmlns:wps="http://schemas.microsoft.com/office/word/2010/wordprocessingShape" mc:Ignorable="w14 wp14">
+  <w:p>
+    <w:pPr>
+      <w:pStyle w:val="Footer"/>
+      <w:jc w:val="center"/>
+    </w:pPr>
+    <w:r>
+      <w:rPr>
+        <w:color w:val="999999"/>
+        <w:sz w:val="18"/>
+      </w:rPr>
+      <w:t xml:space="preserve">第 </w:t>
+    </w:r>
+    <w:r>
+      <w:rPr>
+        <w:color w:val="999999"/>
+        <w:sz w:val="18"/>
+      </w:rPr>
+      <w:fldChar w:fldCharType="begin"/>
+      <w:instrText xml:space="preserve">PAGE</w:instrText>
+      <w:fldChar w:fldCharType="end"/>
+    </w:r>
+    <w:r>
+      <w:rPr>
+        <w:color w:val="999999"/>
+        <w:sz w:val="18"/>
+      </w:rPr>
+      <w:t xml:space="preserve"> 页 / 共 </w:t>
+    </w:r>
+    <w:r>
+      <w:rPr>
+        <w:color w:val="999999"/>
+        <w:sz w:val="18"/>
+      </w:rPr>
+      <w:fldChar w:fldCharType="begin"/>
+      <w:instrText xml:space="preserve">NUMPAGES</w:instrText>
+      <w:fldChar w:fldCharType="end"/>
+    </w:r>
+    <w:r>
+      <w:rPr>
+        <w:color w:val="999999"/>
+        <w:sz w:val="18"/>
+      </w:rPr>
+      <w:t xml:space="preserve"> 页</w:t>
+    </w:r>
+  </w:p>
+</w:ftr>
+</file>
+
+<file path=word/header1.xml><?xml version="1.0" encoding="utf-8"?>
+<w:hdr xmlns:m="http://schemas.openxmlformats.org/officeDocument/2006/math" xmlns:mc="http://schemas.openxmlformats.org/markup-compatibility/2006" xmlns:mo="http://schemas.microsoft.com/office/mac/office/2008/main" xmlns:mv="urn:schemas-microsoft-com:mac:vml" xmlns:o="urn:schemas-microsoft-com:office:office" xmlns:r="http://schemas.openxmlformats.org/officeDocument/2006/relationships" xmlns:v="urn:schemas-microsoft-com:vml" xmlns:w10="urn:schemas-microsoft-com:office:word" xmlns:w14="http://schemas.microsoft.com/office/word/2010/wordml" xmlns:w="http://schemas.openxmlformats.org/wordprocessingml/2006/main" xmlns:wne="http://schemas.microsoft.com/office/word/2006/wordml" xmlns:wp14="http://schemas.microsoft.com/office/word/2010/wordprocessingDrawing" xmlns:wp="http://schemas.openxmlformats.org/drawingml/2006/wordprocessingDrawing" xmlns:wpc="http://schemas.microsoft.com/office/word/2010/wordprocessingCanvas" xmlns:wpg="http://schemas.microsoft.com/office/word/2010/wordprocessingGroup" xmlns:wpi="http://schemas.microsoft.com/office/word/2010/wordprocessingInk" xmlns:wps="http://schemas.microsoft.com/office/word/2010/wordprocessingShape" mc:Ignorable="w14 wp14">
+  <w:p>
+    <w:pPr>
+      <w:pStyle w:val="Header"/>
+      <w:jc w:val="right"/>
+    </w:pPr>
+    <w:r>
+      <w:rPr>
+        <w:color w:val="AAAAAA"/>
+        <w:sz w:val="16"/>
+      </w:rPr>
+      <w:t>分仓占比计算引擎 — 使用说明</w:t>
+    </w:r>
+  </w:p>
+</w:hdr>
 </file>
 
 <file path=word/numbering.xml><?xml version="1.0" encoding="utf-8"?>

</xml_diff>

<commit_message>
fix: sync gen_docx_guide.py with app.py GUIDE_MD - single source of truth
</commit_message>
<xml_diff>
--- a/分仓占比计算引擎_使用说明.docx
+++ b/分仓占比计算引擎_使用说明.docx
@@ -108,6 +108,24 @@
         <w:pStyle w:val="Heading1"/>
       </w:pPr>
       <w:r>
+        <w:t>分仓占比计算引擎 - 使用说明</w:t>
+      </w:r>
+    </w:p>
+    <w:p>
+      <w:r>
+        <w:t>上传历史出单数据 → 调节参数 → 计算各仓库发货占比 → 导出结果</w:t>
+      </w:r>
+    </w:p>
+    <w:p>
+      <w:r>
+        <w:t>四仓占比合计恒为 100% | 最大余额法保证落货量整数精确 | 自动体检防静默失效</w:t>
+      </w:r>
+    </w:p>
+    <w:p>
+      <w:pPr>
+        <w:pStyle w:val="Heading1"/>
+      </w:pPr>
+      <w:r>
         <w:t>1. 系统概述</w:t>
       </w:r>
     </w:p>
@@ -134,7 +152,7 @@
         <w:pStyle w:val="ListBullet"/>
       </w:pPr>
       <w:r>
-        <w:t>时间衰减加权 + 季节匹配因子 + 趋势因子三层加权体系</w:t>
+        <w:t>时间衰减加权（含月份相似度）+ 趋势因子（含单量门槛+动态α）两层加权体系</w:t>
       </w:r>
     </w:p>
     <w:p>
@@ -224,7 +242,7 @@
         <w:pStyle w:val="ListBullet"/>
       </w:pPr>
       <w:r>
-        <w:t>③ 季节匹配因子：强季节 λ、弱季节 λ_weak、窗口范围 N、适用品类（默认折叠）</w:t>
+        <w:t>③ 趋势因子 α：趋势因子 α、单仓调整上限、归一化方式（默认折叠）</w:t>
       </w:r>
     </w:p>
     <w:p>
@@ -232,15 +250,7 @@
         <w:pStyle w:val="ListBullet"/>
       </w:pPr>
       <w:r>
-        <w:t>④ 趋势因子 α：趋势因子 α、单仓调整上限、归一化方式（默认折叠）</w:t>
-      </w:r>
-    </w:p>
-    <w:p>
-      <w:pPr>
-        <w:pStyle w:val="ListBullet"/>
-      </w:pPr>
-      <w:r>
-        <w:t>⑤ 新品与基准：新品阈值、新品订单量门槛、收缩强度 k、权重上/下限、品类层观测数（默认折叠）</w:t>
+        <w:t>④ 新品与基准：新品阈值、新品订单量门槛、收缩强度 k、权重上/下限、品类层观测数（默认折叠）</w:t>
       </w:r>
     </w:p>
     <w:p>
@@ -496,7 +506,7 @@
         <w:pStyle w:val="ListBullet"/>
       </w:pPr>
       <w:r>
-        <w:t>强季节品类的非同月数据权重为 0（不参与计算）</w:t>
+        <w:t>强季节品类的非同月数据：层级回退时用 λ 衰减（无同月数据时启用）</w:t>
       </w:r>
     </w:p>
     <w:p>
@@ -504,181 +514,12 @@
         <w:pStyle w:val="Heading2"/>
       </w:pPr>
       <w:r>
-        <w:t>3.3 季节匹配因子</w:t>
+        <w:t>3.3 趋势因子 α</w:t>
       </w:r>
     </w:p>
     <w:p>
       <w:r>
-        <w:t>对同月/同季数据的权重进行额外放大。作用于加权层，与趋势因子作用层不同，互不冲突。</w:t>
-      </w:r>
-    </w:p>
-    <w:tbl>
-      <w:tblPr>
-        <w:tblStyle w:val="LightGrid-Accent1"/>
-        <w:tblW w:type="auto" w:w="0"/>
-        <w:tblLayout w:type="fixed"/>
-        <w:tblLook w:firstColumn="1" w:firstRow="1" w:lastColumn="0" w:lastRow="0" w:noHBand="0" w:noVBand="1" w:val="04A0"/>
-      </w:tblPr>
-      <w:tblGrid>
-        <w:gridCol w:w="2880"/>
-        <w:gridCol w:w="2880"/>
-        <w:gridCol w:w="2880"/>
-      </w:tblGrid>
-      <w:tr>
-        <w:tc>
-          <w:tcPr>
-            <w:tcW w:type="dxa" w:w="2835"/>
-          </w:tcPr>
-          <w:p>
-            <w:r>
-              <w:rPr>
-                <w:b/>
-              </w:rPr>
-              <w:t>参数</w:t>
-            </w:r>
-          </w:p>
-        </w:tc>
-        <w:tc>
-          <w:tcPr>
-            <w:tcW w:type="dxa" w:w="1134"/>
-          </w:tcPr>
-          <w:p>
-            <w:r>
-              <w:rPr>
-                <w:b/>
-              </w:rPr>
-              <w:t>默认值</w:t>
-            </w:r>
-          </w:p>
-        </w:tc>
-        <w:tc>
-          <w:tcPr>
-            <w:tcW w:type="dxa" w:w="5669"/>
-          </w:tcPr>
-          <w:p>
-            <w:r>
-              <w:rPr>
-                <w:b/>
-              </w:rPr>
-              <w:t>说明</w:t>
-            </w:r>
-          </w:p>
-        </w:tc>
-      </w:tr>
-      <w:tr>
-        <w:tc>
-          <w:tcPr>
-            <w:tcW w:type="dxa" w:w="2835"/>
-          </w:tcPr>
-          <w:p>
-            <w:r>
-              <w:t>强季节增强倍数 λ</w:t>
-            </w:r>
-          </w:p>
-        </w:tc>
-        <w:tc>
-          <w:tcPr>
-            <w:tcW w:type="dxa" w:w="1134"/>
-          </w:tcPr>
-          <w:p>
-            <w:r>
-              <w:t>3.0</w:t>
-            </w:r>
-          </w:p>
-        </w:tc>
-        <w:tc>
-          <w:tcPr>
-            <w:tcW w:type="dxa" w:w="5669"/>
-          </w:tcPr>
-          <w:p>
-            <w:r>
-              <w:t>强季节品类（庭院等）同季数据权重放大倍数</w:t>
-            </w:r>
-          </w:p>
-        </w:tc>
-      </w:tr>
-      <w:tr>
-        <w:tc>
-          <w:tcPr>
-            <w:tcW w:type="dxa" w:w="2835"/>
-          </w:tcPr>
-          <w:p>
-            <w:r>
-              <w:t>弱季节增强倍数 λ_weak</w:t>
-            </w:r>
-          </w:p>
-        </w:tc>
-        <w:tc>
-          <w:tcPr>
-            <w:tcW w:type="dxa" w:w="1134"/>
-          </w:tcPr>
-          <w:p>
-            <w:r>
-              <w:t>1.5</w:t>
-            </w:r>
-          </w:p>
-        </w:tc>
-        <w:tc>
-          <w:tcPr>
-            <w:tcW w:type="dxa" w:w="5669"/>
-          </w:tcPr>
-          <w:p>
-            <w:r>
-              <w:t>弱季节品类同月数据权重放大倍数。1.0=不放大</w:t>
-            </w:r>
-          </w:p>
-        </w:tc>
-      </w:tr>
-      <w:tr>
-        <w:tc>
-          <w:tcPr>
-            <w:tcW w:type="dxa" w:w="2835"/>
-          </w:tcPr>
-          <w:p>
-            <w:r>
-              <w:t>季节窗口范围 N</w:t>
-            </w:r>
-          </w:p>
-        </w:tc>
-        <w:tc>
-          <w:tcPr>
-            <w:tcW w:type="dxa" w:w="1134"/>
-          </w:tcPr>
-          <w:p>
-            <w:r>
-              <w:t>1</w:t>
-            </w:r>
-          </w:p>
-        </w:tc>
-        <w:tc>
-          <w:tcPr>
-            <w:tcW w:type="dxa" w:w="5669"/>
-          </w:tcPr>
-          <w:p>
-            <w:r>
-              <w:t>窗口 = 目标月前 N 个月（环形距离）。N=1：发1月货→命中12月</w:t>
-            </w:r>
-          </w:p>
-        </w:tc>
-      </w:tr>
-    </w:tbl>
-    <w:p/>
-    <w:p>
-      <w:r>
-        <w:t>适用品类：从上传数据中动态识别，默认勾选「庭院、草坪与花园」和「庭院」，可手动增删。</w:t>
-      </w:r>
-    </w:p>
-    <w:p>
-      <w:pPr>
-        <w:pStyle w:val="Heading2"/>
-      </w:pPr>
-      <w:r>
-        <w:t>3.4 趋势因子 α</w:t>
-      </w:r>
-    </w:p>
-    <w:p>
-      <w:r>
-        <w:t>比较「去年同期」与「前年同期」的分仓占比差，把趋势方向叠加到最终占比上。使用原始单量占比计算（不受衰减权重和季节因子干扰）。</w:t>
+        <w:t>比较「去年同期」与「前年同期」的分仓占比差，把趋势方向叠加到最终占比上。使用原始单量占比计算。</w:t>
       </w:r>
     </w:p>
     <w:tbl>
@@ -805,6 +646,38 @@
           </w:tcPr>
           <w:p>
             <w:r>
+              <w:t>趋势单量门槛</w:t>
+            </w:r>
+          </w:p>
+        </w:tc>
+        <w:tc>
+          <w:tcPr>
+            <w:tcW w:type="dxa" w:w="1134"/>
+          </w:tcPr>
+          <w:p>
+            <w:r>
+              <w:t>30</w:t>
+            </w:r>
+          </w:p>
+        </w:tc>
+        <w:tc>
+          <w:tcPr>
+            <w:tcW w:type="dxa" w:w="5669"/>
+          </w:tcPr>
+          <w:p>
+            <w:r>
+              <w:t>去年+前年同期总单量低于此值跳过趋势调整</w:t>
+            </w:r>
+          </w:p>
+        </w:tc>
+      </w:tr>
+      <w:tr>
+        <w:tc>
+          <w:tcPr>
+            <w:tcW w:type="dxa" w:w="2835"/>
+          </w:tcPr>
+          <w:p>
+            <w:r>
               <w:t>归一化方式</w:t>
             </w:r>
           </w:p>
@@ -837,7 +710,7 @@
         <w:pStyle w:val="Heading2"/>
       </w:pPr>
       <w:r>
-        <w:t>3.5 新品与基准</w:t>
+        <w:t>3.4 新品与基准</w:t>
       </w:r>
     </w:p>
     <w:p>
@@ -1145,7 +1018,7 @@
       <w:tr>
         <w:tc>
           <w:tcPr>
-            <w:tcW w:type="dxa" w:w="1984"/>
+            <w:tcW w:type="dxa" w:w="907"/>
           </w:tcPr>
           <w:p>
             <w:r>
@@ -1158,7 +1031,7 @@
         </w:tc>
         <w:tc>
           <w:tcPr>
-            <w:tcW w:type="dxa" w:w="1701"/>
+            <w:tcW w:type="dxa" w:w="907"/>
           </w:tcPr>
           <w:p>
             <w:r>
@@ -1171,7 +1044,7 @@
         </w:tc>
         <w:tc>
           <w:tcPr>
-            <w:tcW w:type="dxa" w:w="850"/>
+            <w:tcW w:type="dxa" w:w="907"/>
           </w:tcPr>
           <w:p>
             <w:r>
@@ -1184,7 +1057,7 @@
         </w:tc>
         <w:tc>
           <w:tcPr>
-            <w:tcW w:type="dxa" w:w="850"/>
+            <w:tcW w:type="dxa" w:w="907"/>
           </w:tcPr>
           <w:p>
             <w:r>
@@ -1197,7 +1070,7 @@
         </w:tc>
         <w:tc>
           <w:tcPr>
-            <w:tcW w:type="dxa" w:w="567"/>
+            <w:tcW w:type="dxa" w:w="907"/>
           </w:tcPr>
           <w:p>
             <w:r>
@@ -1210,7 +1083,7 @@
         </w:tc>
         <w:tc>
           <w:tcPr>
-            <w:tcW w:type="dxa" w:w="567"/>
+            <w:tcW w:type="dxa" w:w="907"/>
           </w:tcPr>
           <w:p>
             <w:r>
@@ -1223,7 +1096,7 @@
         </w:tc>
         <w:tc>
           <w:tcPr>
-            <w:tcW w:type="dxa" w:w="567"/>
+            <w:tcW w:type="dxa" w:w="907"/>
           </w:tcPr>
           <w:p>
             <w:r>
@@ -1236,7 +1109,7 @@
         </w:tc>
         <w:tc>
           <w:tcPr>
-            <w:tcW w:type="dxa" w:w="567"/>
+            <w:tcW w:type="dxa" w:w="907"/>
           </w:tcPr>
           <w:p>
             <w:r>
@@ -1249,7 +1122,7 @@
         </w:tc>
         <w:tc>
           <w:tcPr>
-            <w:tcW w:type="dxa" w:w="850"/>
+            <w:tcW w:type="dxa" w:w="907"/>
           </w:tcPr>
           <w:p>
             <w:r>
@@ -1262,7 +1135,7 @@
         </w:tc>
         <w:tc>
           <w:tcPr>
-            <w:tcW w:type="dxa" w:w="850"/>
+            <w:tcW w:type="dxa" w:w="907"/>
           </w:tcPr>
           <w:p>
             <w:r>
@@ -1277,7 +1150,7 @@
       <w:tr>
         <w:tc>
           <w:tcPr>
-            <w:tcW w:type="dxa" w:w="1984"/>
+            <w:tcW w:type="dxa" w:w="907"/>
           </w:tcPr>
           <w:p>
             <w:r>
@@ -1287,7 +1160,7 @@
         </w:tc>
         <w:tc>
           <w:tcPr>
-            <w:tcW w:type="dxa" w:w="1701"/>
+            <w:tcW w:type="dxa" w:w="907"/>
           </w:tcPr>
           <w:p>
             <w:r>
@@ -1297,7 +1170,7 @@
         </w:tc>
         <w:tc>
           <w:tcPr>
-            <w:tcW w:type="dxa" w:w="850"/>
+            <w:tcW w:type="dxa" w:w="907"/>
           </w:tcPr>
           <w:p>
             <w:r>
@@ -1307,7 +1180,7 @@
         </w:tc>
         <w:tc>
           <w:tcPr>
-            <w:tcW w:type="dxa" w:w="850"/>
+            <w:tcW w:type="dxa" w:w="907"/>
           </w:tcPr>
           <w:p>
             <w:r>
@@ -1317,7 +1190,7 @@
         </w:tc>
         <w:tc>
           <w:tcPr>
-            <w:tcW w:type="dxa" w:w="567"/>
+            <w:tcW w:type="dxa" w:w="907"/>
           </w:tcPr>
           <w:p>
             <w:r>
@@ -1327,7 +1200,7 @@
         </w:tc>
         <w:tc>
           <w:tcPr>
-            <w:tcW w:type="dxa" w:w="567"/>
+            <w:tcW w:type="dxa" w:w="907"/>
           </w:tcPr>
           <w:p>
             <w:r>
@@ -1337,7 +1210,7 @@
         </w:tc>
         <w:tc>
           <w:tcPr>
-            <w:tcW w:type="dxa" w:w="567"/>
+            <w:tcW w:type="dxa" w:w="907"/>
           </w:tcPr>
           <w:p>
             <w:r>
@@ -1347,7 +1220,7 @@
         </w:tc>
         <w:tc>
           <w:tcPr>
-            <w:tcW w:type="dxa" w:w="567"/>
+            <w:tcW w:type="dxa" w:w="907"/>
           </w:tcPr>
           <w:p>
             <w:r>
@@ -1357,7 +1230,7 @@
         </w:tc>
         <w:tc>
           <w:tcPr>
-            <w:tcW w:type="dxa" w:w="850"/>
+            <w:tcW w:type="dxa" w:w="907"/>
           </w:tcPr>
           <w:p>
             <w:r>
@@ -1367,7 +1240,7 @@
         </w:tc>
         <w:tc>
           <w:tcPr>
-            <w:tcW w:type="dxa" w:w="850"/>
+            <w:tcW w:type="dxa" w:w="907"/>
           </w:tcPr>
           <w:p>
             <w:r>
@@ -1438,7 +1311,7 @@
         <w:pStyle w:val="ListBullet"/>
       </w:pPr>
       <w:r>
-        <w:t>自动体检：四仓占比合计=100%、季节因子命中行数、趋势因子生效数</w:t>
+        <w:t>自动体检：四仓占比合计=100%、趋势因子生效数（含动态α）</w:t>
       </w:r>
     </w:p>
     <w:p>
@@ -1610,7 +1483,7 @@
     </w:p>
     <w:p>
       <w:r>
-        <w:t>强季节品类只看目标期同月数据，用 λ_same（0.95）跨年衰减。弱季节品类放开全部月份，同月用 λ_same，非同月用 λ（0.85）。</w:t>
+        <w:t>时间衰减 × 月份相似度。同月数据用 λ_same（0.95）跨年衰减。非同月数据用 λ（0.85）衰减，再乘月份相似度权重（同月1.0/相邻月0.6/隔2月0.3/隔3月以上0.1），让目标月附近的非同月数据也有参考价值。</w:t>
       </w:r>
     </w:p>
     <w:p>
@@ -1618,12 +1491,12 @@
         <w:pStyle w:val="Heading2"/>
       </w:pPr>
       <w:r>
-        <w:t>步骤3：季节匹配因子</w:t>
+        <w:t>步骤3：自身占比</w:t>
       </w:r>
     </w:p>
     <w:p>
       <w:r>
-        <w:t>强季节品类 + 季节窗口内 → 权重 × λ（3.0）。弱季节品类 + 同月 → 权重 × λ_weak（1.5）。其他 × 1.0。</w:t>
+        <w:t>加权后的各仓出单量 ÷ 加权合计，逐仓计算。层级回退：有同月数据时优先用同月，无同月数据时用全部历史数据。</w:t>
       </w:r>
     </w:p>
     <w:p>
@@ -1631,20 +1504,7 @@
         <w:pStyle w:val="Heading2"/>
       </w:pPr>
       <w:r>
-        <w:t>步骤4：自身占比</w:t>
-      </w:r>
-    </w:p>
-    <w:p>
-      <w:r>
-        <w:t>加权后的各仓出单量 ÷ 加权合计，逐仓计算。</w:t>
-      </w:r>
-    </w:p>
-    <w:p>
-      <w:pPr>
-        <w:pStyle w:val="Heading2"/>
-      </w:pPr>
-      <w:r>
-        <w:t>步骤5：基准占比</w:t>
+        <w:t>步骤4：基准占比</w:t>
       </w:r>
     </w:p>
     <w:p>
@@ -1667,7 +1527,7 @@
       <w:tr>
         <w:tc>
           <w:tcPr>
-            <w:tcW w:type="dxa" w:w="1134"/>
+            <w:tcW w:type="dxa" w:w="2835"/>
           </w:tcPr>
           <w:p>
             <w:r>
@@ -1680,7 +1540,7 @@
         </w:tc>
         <w:tc>
           <w:tcPr>
-            <w:tcW w:type="dxa" w:w="2268"/>
+            <w:tcW w:type="dxa" w:w="1134"/>
           </w:tcPr>
           <w:p>
             <w:r>
@@ -1693,7 +1553,7 @@
         </w:tc>
         <w:tc>
           <w:tcPr>
-            <w:tcW w:type="dxa" w:w="6236"/>
+            <w:tcW w:type="dxa" w:w="5669"/>
           </w:tcPr>
           <w:p>
             <w:r>
@@ -1708,7 +1568,7 @@
       <w:tr>
         <w:tc>
           <w:tcPr>
-            <w:tcW w:type="dxa" w:w="1134"/>
+            <w:tcW w:type="dxa" w:w="2835"/>
           </w:tcPr>
           <w:p>
             <w:r>
@@ -1718,7 +1578,7 @@
         </w:tc>
         <w:tc>
           <w:tcPr>
-            <w:tcW w:type="dxa" w:w="2268"/>
+            <w:tcW w:type="dxa" w:w="1134"/>
           </w:tcPr>
           <w:p>
             <w:r>
@@ -1728,7 +1588,7 @@
         </w:tc>
         <w:tc>
           <w:tcPr>
-            <w:tcW w:type="dxa" w:w="6236"/>
+            <w:tcW w:type="dxa" w:w="5669"/>
           </w:tcPr>
           <w:p>
             <w:r>
@@ -1740,7 +1600,7 @@
       <w:tr>
         <w:tc>
           <w:tcPr>
-            <w:tcW w:type="dxa" w:w="1134"/>
+            <w:tcW w:type="dxa" w:w="2835"/>
           </w:tcPr>
           <w:p>
             <w:r>
@@ -1750,7 +1610,7 @@
         </w:tc>
         <w:tc>
           <w:tcPr>
-            <w:tcW w:type="dxa" w:w="2268"/>
+            <w:tcW w:type="dxa" w:w="1134"/>
           </w:tcPr>
           <w:p>
             <w:r>
@@ -1760,7 +1620,7 @@
         </w:tc>
         <w:tc>
           <w:tcPr>
-            <w:tcW w:type="dxa" w:w="6236"/>
+            <w:tcW w:type="dxa" w:w="5669"/>
           </w:tcPr>
           <w:p>
             <w:r>
@@ -1772,7 +1632,7 @@
       <w:tr>
         <w:tc>
           <w:tcPr>
-            <w:tcW w:type="dxa" w:w="1134"/>
+            <w:tcW w:type="dxa" w:w="2835"/>
           </w:tcPr>
           <w:p>
             <w:r>
@@ -1782,7 +1642,7 @@
         </w:tc>
         <w:tc>
           <w:tcPr>
-            <w:tcW w:type="dxa" w:w="2268"/>
+            <w:tcW w:type="dxa" w:w="1134"/>
           </w:tcPr>
           <w:p>
             <w:r>
@@ -1792,7 +1652,7 @@
         </w:tc>
         <w:tc>
           <w:tcPr>
-            <w:tcW w:type="dxa" w:w="6236"/>
+            <w:tcW w:type="dxa" w:w="5669"/>
           </w:tcPr>
           <w:p>
             <w:r>
@@ -1804,7 +1664,7 @@
       <w:tr>
         <w:tc>
           <w:tcPr>
-            <w:tcW w:type="dxa" w:w="1134"/>
+            <w:tcW w:type="dxa" w:w="2835"/>
           </w:tcPr>
           <w:p>
             <w:r>
@@ -1814,7 +1674,7 @@
         </w:tc>
         <w:tc>
           <w:tcPr>
-            <w:tcW w:type="dxa" w:w="2268"/>
+            <w:tcW w:type="dxa" w:w="1134"/>
           </w:tcPr>
           <w:p>
             <w:r>
@@ -1824,7 +1684,7 @@
         </w:tc>
         <w:tc>
           <w:tcPr>
-            <w:tcW w:type="dxa" w:w="6236"/>
+            <w:tcW w:type="dxa" w:w="5669"/>
           </w:tcPr>
           <w:p>
             <w:r>
@@ -1836,7 +1696,7 @@
       <w:tr>
         <w:tc>
           <w:tcPr>
-            <w:tcW w:type="dxa" w:w="1134"/>
+            <w:tcW w:type="dxa" w:w="2835"/>
           </w:tcPr>
           <w:p>
             <w:r>
@@ -1846,7 +1706,7 @@
         </w:tc>
         <w:tc>
           <w:tcPr>
-            <w:tcW w:type="dxa" w:w="2268"/>
+            <w:tcW w:type="dxa" w:w="1134"/>
           </w:tcPr>
           <w:p>
             <w:r>
@@ -1856,7 +1716,7 @@
         </w:tc>
         <w:tc>
           <w:tcPr>
-            <w:tcW w:type="dxa" w:w="6236"/>
+            <w:tcW w:type="dxa" w:w="5669"/>
           </w:tcPr>
           <w:p>
             <w:r>
@@ -1868,7 +1728,7 @@
       <w:tr>
         <w:tc>
           <w:tcPr>
-            <w:tcW w:type="dxa" w:w="1134"/>
+            <w:tcW w:type="dxa" w:w="2835"/>
           </w:tcPr>
           <w:p>
             <w:r>
@@ -1878,7 +1738,7 @@
         </w:tc>
         <w:tc>
           <w:tcPr>
-            <w:tcW w:type="dxa" w:w="2268"/>
+            <w:tcW w:type="dxa" w:w="1134"/>
           </w:tcPr>
           <w:p>
             <w:r>
@@ -1888,7 +1748,7 @@
         </w:tc>
         <w:tc>
           <w:tcPr>
-            <w:tcW w:type="dxa" w:w="6236"/>
+            <w:tcW w:type="dxa" w:w="5669"/>
           </w:tcPr>
           <w:p>
             <w:r>
@@ -1900,7 +1760,7 @@
       <w:tr>
         <w:tc>
           <w:tcPr>
-            <w:tcW w:type="dxa" w:w="1134"/>
+            <w:tcW w:type="dxa" w:w="2835"/>
           </w:tcPr>
           <w:p>
             <w:r>
@@ -1910,7 +1770,7 @@
         </w:tc>
         <w:tc>
           <w:tcPr>
-            <w:tcW w:type="dxa" w:w="2268"/>
+            <w:tcW w:type="dxa" w:w="1134"/>
           </w:tcPr>
           <w:p>
             <w:r>
@@ -1920,11 +1780,11 @@
         </w:tc>
         <w:tc>
           <w:tcPr>
-            <w:tcW w:type="dxa" w:w="6236"/>
+            <w:tcW w:type="dxa" w:w="5669"/>
           </w:tcPr>
           <w:p>
             <w:r>
-              <w:t>整体占比兖底</w:t>
+              <w:t>整体占比兜底</w:t>
             </w:r>
           </w:p>
         </w:tc>
@@ -1941,7 +1801,7 @@
         <w:pStyle w:val="Heading2"/>
       </w:pPr>
       <w:r>
-        <w:t>步骤6：最终占比</w:t>
+        <w:t>步骤5：最终占比</w:t>
       </w:r>
     </w:p>
     <w:p>
@@ -1956,7 +1816,7 @@
     </w:p>
     <w:p>
       <w:r>
-        <w:t>趋势调整用原始单量占比（不受衰减和季节因子干扰），比较去年同期 vs 前年同期的占比差。</w:t>
+        <w:t>趋势调整用原始单量占比，比较去年同期 vs 前年同期的占比差。单量门槛+动态α：去年+前年同期总单量≥100用原始α，30-100单用α/2，&lt;30单跳过趋势调整。</w:t>
       </w:r>
     </w:p>
     <w:p>
@@ -1964,7 +1824,7 @@
         <w:pStyle w:val="Heading2"/>
       </w:pPr>
       <w:r>
-        <w:t>步骤7：落货量</w:t>
+        <w:t>步骤6：落货量</w:t>
       </w:r>
     </w:p>
     <w:p>
@@ -1998,12 +1858,12 @@
         <w:pStyle w:val="Heading2"/>
       </w:pPr>
       <w:r>
-        <w:t>Q1：目标期设定为 5月，趋势因子参考哪些时间？</w:t>
+        <w:t>Q1：目标期设定为5月，趋势因子参考哪些时间？</w:t>
       </w:r>
     </w:p>
     <w:p>
       <w:r>
-        <w:t>A：趋势因子比较去年同期（2026年5月）与前年同期（2025年5月）的原始单量占比差。多月目标期（如4-6月）则参考4-6月。</w:t>
+        <w:t>趋势因子比较去年同期（2026年5月）与前年同期（2025年5月）的原始单量占比差。多月目标期（如4-6月）则参考4-6月。</w:t>
       </w:r>
     </w:p>
     <w:p>
@@ -2016,7 +1876,7 @@
     </w:p>
     <w:p>
       <w:r>
-        <w:t>A：强季节品类 = 侧边栏「季节适用品类」多选框中勾选的品类（默认庭院类）。不在列表中的品类自动归为弱季节。</w:t>
+        <w:t>强季节品类 = 侧边栏「季节适用品类」多选框中勾选的品类（默认庭院类）。不在列表中的品类自动归为弱季节。</w:t>
       </w:r>
     </w:p>
     <w:p>
@@ -2029,7 +1889,7 @@
     </w:p>
     <w:p>
       <w:r>
-        <w:t>A：λ_same（0.95）用于同月数据跨年衰减，去年同月保留95%，前年同月保留90%。λ（0.85）用于弱季节品类的非同月数据衰减，1个月前85%，6个月前38%。同月数据参考价值更高，所以衰减更慢。</w:t>
+        <w:t>λ_same（0.95）用于同月数据跨年衰减，去年同月保留95%，前年同月保留90%。λ（0.85）用于弱季节品类的非同月数据衰减，1个月前85%，6个月前38%。同月数据参考价值更高，所以衰减更慢。</w:t>
       </w:r>
     </w:p>
     <w:p>
@@ -2042,7 +1902,7 @@
     </w:p>
     <w:p>
       <w:r>
-        <w:t>A：历史出单月数 ≤ 2 或 目标期总单量 &lt; 10，满足任一即视为新品。新品自身权重=0，完全使用基准占比（从 SPU 到全公司逐级回退）。</w:t>
+        <w:t>历史出单月数 ≤ 2 或 目标期总单量 &lt; 10，满足任一即视为新品。新品自身权重=0，完全使用基准占比（从 SPU 到全公司逐级回退）。</w:t>
       </w:r>
     </w:p>
     <w:p>
@@ -2055,7 +1915,7 @@
     </w:p>
     <w:p>
       <w:r>
-        <w:t>A：不影响。减仓仅修改 SKU 层的「调整后」列，一级分类/室内外/SPU/全公司的聚合使用减仓前的原始数据。</w:t>
+        <w:t>不影响。减仓仅修改 SKU 层的「调整后」列，一级分类/室内外/SPU/全公司的聚合使用减仓前的原始数据。</w:t>
       </w:r>
     </w:p>
     <w:p>
@@ -2068,7 +1928,7 @@
     </w:p>
     <w:p>
       <w:r>
-        <w:t>A：是的。引擎计算后自动归一化，趋势调整后再次归一化，微调时自动补足，自检验证偏差 &lt; 1e-9。</w:t>
+        <w:t>是的。引擎计算后自动归一化，趋势调整后再次归一化，微调时自动补足，自检验证偏差 &lt; 1e-9。</w:t>
       </w:r>
     </w:p>
     <w:p>
@@ -2076,12 +1936,12 @@
         <w:pStyle w:val="Heading2"/>
       </w:pPr>
       <w:r>
-        <w:t>Q7：趋势因子和季节因子会冲突吗？</w:t>
+        <w:t>Q7：趋势因子用什么数据计算？低单量SKU会怎样？</w:t>
       </w:r>
     </w:p>
     <w:p>
       <w:r>
-        <w:t>A：不会。季节因子作用于加权层（步骤3），趋势因子作用于最终占比层（步骤6），两者作用层不同。趋势因子用原始数据计算，不受衰减和季节因子干扰。</w:t>
+        <w:t>趋势因子用原始单量占比（不加衰减权重），比较去年同期 vs 前年同期的分仓占比差。动态α：≥100单用原始α，30-100单用α/2，&lt;30单跳过趋势调整。与时间衰减加权作用层不同，互不干扰。</w:t>
       </w:r>
     </w:p>
     <w:sectPr>
@@ -2155,8 +2015,8 @@
     </w:pPr>
     <w:r>
       <w:rPr>
-        <w:color w:val="AAAAAA"/>
-        <w:sz w:val="16"/>
+        <w:color w:val="999999"/>
+        <w:sz w:val="18"/>
       </w:rPr>
       <w:t>分仓占比计算引擎 — 使用说明</w:t>
     </w:r>

</xml_diff>

<commit_message>
update app.py and sync docx guide
</commit_message>
<xml_diff>
--- a/分仓占比计算引擎_使用说明.docx
+++ b/分仓占比计算引擎_使用说明.docx
@@ -648,7 +648,7 @@
           </w:tcPr>
           <w:p>
             <w:r>
-              <w:t>30</w:t>
+              <w:t>50</w:t>
             </w:r>
           </w:p>
         </w:tc>
@@ -780,7 +780,7 @@
           </w:tcPr>
           <w:p>
             <w:r>
-              <w:t>10</w:t>
+              <w:t>20</w:t>
             </w:r>
           </w:p>
         </w:tc>
@@ -812,7 +812,7 @@
           </w:tcPr>
           <w:p>
             <w:r>
-              <w:t>6</w:t>
+              <w:t>8</w:t>
             </w:r>
           </w:p>
         </w:tc>
@@ -927,7 +927,7 @@
     <w:p/>
     <w:p>
       <w:r>
-        <w:t>新品判定逻辑：历史月数 ≤ 阈值 或 目标期总单量 &lt; 门槛 → 视为新品，自身权重=0，完全使用基准占比。</w:t>
+        <w:t>新品判定逻辑：历史月数 ≤ 阈值 或 目标期总单量 &lt; 门槛 → 视为新品，自身权重=0，完全使用基准占比。门槛默认20单，避免低单量SKU分仓偶然性。</w:t>
       </w:r>
     </w:p>
     <w:p>
@@ -1242,7 +1242,7 @@
         <w:pStyle w:val="ListBullet"/>
       </w:pPr>
       <w:r>
-        <w:t>SKU级集中度自动检测：两个滑块（整数范围，高阈值50-100%默认80%，低阈值0-50%默认20%）。系统自动算每个SKU在目标期同月的出单量占全年的比例。集中度≥高阈值→自动强季节（即使品类未勾选），≤低阈值→自动弱季节（即使品类已勾选），中间→跟随品类勾选</w:t>
+        <w:t>SKU级集中度自动检测：两个滑块（整数范围，高阈值50-100%默认70%，低阈值0-50%默认20%）。系统自动算每个SKU在目标期同月的出单量占全年的比例。集中度≥高阈值→自动强季节（即使品类未勾选），≤低阈值→自动弱季节（即使品类已勾选），中间→跟随品类勾选</w:t>
       </w:r>
     </w:p>
     <w:p>
@@ -1469,7 +1469,7 @@
         <w:pStyle w:val="ListBullet"/>
       </w:pPr>
       <w:r>
-        <w:t>集中度≥80% → 自动强季节（即使品类未勾选）：只用目标期同月数据</w:t>
+        <w:t>集中度≥70% → 自动强季节（即使品类未勾选）：只用目标期同月数据</w:t>
       </w:r>
     </w:p>
     <w:p>
@@ -1485,7 +1485,7 @@
         <w:pStyle w:val="ListBullet"/>
       </w:pPr>
       <w:r>
-        <w:t>中间（20%-80%）→ 跟随品类勾选：勾选的品类用同月数据，未勾选的用全部月份</w:t>
+        <w:t>中间（20%-70%）→ 跟随品类勾选：勾选的品类用同月数据，未勾选的用全部月份</w:t>
       </w:r>
     </w:p>
     <w:p>
@@ -1805,12 +1805,12 @@
     </w:p>
     <w:p>
       <w:r>
-        <w:t>新品（历史月数≤2 或 目标期原始单量&lt;10）自身权重=0，完全使用基准。</w:t>
+        <w:t>新品（历史月数≤2 或 目标期原始单量&lt;20）自身权重=0，完全使用基准。</w:t>
       </w:r>
     </w:p>
     <w:p>
       <w:r>
-        <w:t>趋势调整用原始单量占比，比较去年同期 vs 前年同期的占比差。单量门槛+动态α：去年+前年同期总单量≥100用原始α，30-100单用α/2，&lt;30单或任一侧为0单跳过趋势调整。</w:t>
+        <w:t>趋势调整用原始单量占比，比较去年同期 vs 前年同期的占比差。单量门槛+动态α：去年+前年同期总单量≥100用原始α，50-100单用α/2，&lt;50单或任一侧为0单跳过趋势调整。</w:t>
       </w:r>
     </w:p>
     <w:p>
@@ -1854,7 +1854,7 @@
     </w:p>
     <w:p>
       <w:r>
-        <w:t>三步判断：①先算SKU集中度（目标期同月出单量÷全年总量）→②集中度≥高阈值（默认80%）自动强季节，≤低阈值（默认20%）自动弱季节→③集中度在中间的跟随品类勾选。强季节只用目标期同月数据，弱季节用全部月份加权。阈值可在"开始计算"区域滑块调节。</w:t>
+        <w:t>三步判断：①先算SKU集中度（目标期同月出单量÷全年总量）→②集中度≥高阈值（默认70%）自动强季节，≤低阈值（默认20%）自动弱季节→③集中度在中间的跟随品类勾选。强季节只用目标期同月数据，弱季节用全部月份加权。阈值可在"开始计算"区域滑块调节。</w:t>
       </w:r>
     </w:p>
     <w:p>
@@ -1919,7 +1919,7 @@
     </w:p>
     <w:p>
       <w:r>
-        <w:t>趋势因子用原始单量占比（不加衰减权重），比较去年同期 vs 前年同期的分仓占比差。动态α：≥100单用原始α，30-100单用α/2，&lt;30单跳过趋势调整。与时间衰减加权作用层不同，互不干扰。</w:t>
+        <w:t>趋势因子用原始单量占比（不加衰减权重），比较去年同期 vs 前年同期的分仓占比差。动态α：≥100单用原始α，50-100单用α/2，&lt;50单跳过趋势调整。与时间衰减加权作用层不同，互不干扰。</w:t>
       </w:r>
     </w:p>
     <w:sectPr>

</xml_diff>

<commit_message>
docs: add business background (problems + solutions) to system overview in guide.md and app.py
</commit_message>
<xml_diff>
--- a/分仓占比计算引擎_使用说明.docx
+++ b/分仓占比计算引擎_使用说明.docx
@@ -99,6 +99,42 @@
           <w:sz w:val="22"/>
         </w:rPr>
         <w:t>1. 系统概述</w:t>
+      </w:r>
+    </w:p>
+    <w:p>
+      <w:pPr>
+        <w:ind w:left="567"/>
+      </w:pPr>
+      <w:r>
+        <w:rPr>
+          <w:color w:val="555555"/>
+          <w:sz w:val="20"/>
+        </w:rPr>
+        <w:t>1.1 为什么需要这个工具</w:t>
+      </w:r>
+    </w:p>
+    <w:p>
+      <w:pPr>
+        <w:ind w:left="567"/>
+      </w:pPr>
+      <w:r>
+        <w:rPr>
+          <w:color w:val="555555"/>
+          <w:sz w:val="20"/>
+        </w:rPr>
+        <w:t>1.2 本工具如何解决这些问题</w:t>
+      </w:r>
+    </w:p>
+    <w:p>
+      <w:pPr>
+        <w:ind w:left="567"/>
+      </w:pPr>
+      <w:r>
+        <w:rPr>
+          <w:color w:val="555555"/>
+          <w:sz w:val="20"/>
+        </w:rPr>
+        <w:t>1.3 核心能力</w:t>
       </w:r>
     </w:p>
     <w:p>
@@ -481,21 +517,195 @@
       </w:r>
     </w:p>
     <w:p>
+      <w:pPr>
+        <w:pStyle w:val="Heading2"/>
+      </w:pPr>
+      <w:r>
+        <w:t>1.1 为什么需要这个工具</w:t>
+      </w:r>
+    </w:p>
+    <w:p>
       <w:r>
         <w:t>分仓占比计算引擎是一款面向跨境电商运营人员的工具，用于计算各 SKU 在四个仓库（美西、美东、美南GA、美南TX）的发货占比。</w:t>
       </w:r>
     </w:p>
     <w:p>
       <w:r>
-        <w:t>核心能力：</w:t>
+        <w:t>公司现状：运算发货月份的分仓数据时，仅参考去年同期的订单数据。这一做法存在以下问题：</w:t>
       </w:r>
     </w:p>
     <w:p>
+      <w:r>
+        <w:t>问题一：非季节性产品缺乏合理性</w:t>
+      </w:r>
+    </w:p>
+    <w:p>
       <w:pPr>
         <w:pStyle w:val="ListBullet"/>
       </w:pPr>
       <w:r>
-        <w:t>基于历史出单数据计算各 SKU 的分仓占比，支持多年份数据</w:t>
+        <w:t>非季节性产品的分仓分布在各月份相对稳定，仅参考去年同一个月的数据样本量小、偶然性大</w:t>
+      </w:r>
+    </w:p>
+    <w:p>
+      <w:pPr>
+        <w:pStyle w:val="ListBullet"/>
+      </w:pPr>
+      <w:r>
+        <w:t>例如某SKU去年同月美西10单、美东8单，但全年看美西占60%、美东占40%，仅用同月数据会放大偶然偏差</w:t>
+      </w:r>
+    </w:p>
+    <w:p>
+      <w:r>
+        <w:t>问题二：新品数据不稳定</w:t>
+      </w:r>
+    </w:p>
+    <w:p>
+      <w:pPr>
+        <w:pStyle w:val="ListBullet"/>
+      </w:pPr>
+      <w:r>
+        <w:t>新品上架初期出单量小、分仓随机性大，直接照搬去年同期数据会导致分仓比例失真</w:t>
+      </w:r>
+    </w:p>
+    <w:p>
+      <w:pPr>
+        <w:pStyle w:val="ListBullet"/>
+      </w:pPr>
+      <w:r>
+        <w:t>特别是上架不足3个月的新品，几乎没有可参考的历史分仓数据</w:t>
+      </w:r>
+    </w:p>
+    <w:p>
+      <w:r>
+        <w:t>问题三：其他年份数据未合理利用</w:t>
+      </w:r>
+    </w:p>
+    <w:p>
+      <w:pPr>
+        <w:pStyle w:val="ListBullet"/>
+      </w:pPr>
+      <w:r>
+        <w:t>仅参考去年同月，前年同月和其他月份的数据被完全忽略</w:t>
+      </w:r>
+    </w:p>
+    <w:p>
+      <w:pPr>
+        <w:pStyle w:val="ListBullet"/>
+      </w:pPr>
+      <w:r>
+        <w:t>前年同月的数据对趋势判断有价值，其他月份的数据对非季节性产品有参考意义</w:t>
+      </w:r>
+    </w:p>
+    <w:p>
+      <w:pPr>
+        <w:pStyle w:val="ListBullet"/>
+      </w:pPr>
+      <w:r>
+        <w:t>大量历史数据闲置，未发挥应有的辅助作用</w:t>
+      </w:r>
+    </w:p>
+    <w:p>
+      <w:pPr>
+        <w:pStyle w:val="Heading2"/>
+      </w:pPr>
+      <w:r>
+        <w:t>1.2 本工具如何解决这些问题</w:t>
+      </w:r>
+    </w:p>
+    <w:p>
+      <w:r>
+        <w:t>针对问题一（非季节性产品）：全量数据+时间衰减加权</w:t>
+      </w:r>
+    </w:p>
+    <w:p>
+      <w:pPr>
+        <w:pStyle w:val="ListBullet"/>
+      </w:pPr>
+      <w:r>
+        <w:t>非季节性产品使用全部历史月份的数据，而非仅去年同月</w:t>
+      </w:r>
+    </w:p>
+    <w:p>
+      <w:pPr>
+        <w:pStyle w:val="ListBullet"/>
+      </w:pPr>
+      <w:r>
+        <w:t>时间越近的数据权重越大（指数衰减），既充分利用历史数据又突出近期趋势</w:t>
+      </w:r>
+    </w:p>
+    <w:p>
+      <w:pPr>
+        <w:pStyle w:val="ListBullet"/>
+      </w:pPr>
+      <w:r>
+        <w:t>月份相似度加权：同月权重最高（1.0），相邻月次之（0.6），隔2月再次（0.3），隔3月以上最低（0.1）</w:t>
+      </w:r>
+    </w:p>
+    <w:p>
+      <w:r>
+        <w:t>针对问题二（新品不稳定）：基准占比层级回退+贝叶斯收缩</w:t>
+      </w:r>
+    </w:p>
+    <w:p>
+      <w:pPr>
+        <w:pStyle w:val="ListBullet"/>
+      </w:pPr>
+      <w:r>
+        <w:t>新品（历史月数≤2 或 目标期总单量&lt;20）自身权重为0，完全使用基准占比</w:t>
+      </w:r>
+    </w:p>
+    <w:p>
+      <w:pPr>
+        <w:pStyle w:val="ListBullet"/>
+      </w:pPr>
+      <w:r>
+        <w:t>基准按 SPU → 一级分类 → 室内外 → 全公司 逐层回退，数据少的层级自动回退到更稳定的父层</w:t>
+      </w:r>
+    </w:p>
+    <w:p>
+      <w:pPr>
+        <w:pStyle w:val="ListBullet"/>
+      </w:pPr>
+      <w:r>
+        <w:t>每层通过贝叶斯收缩平衡自身数据与父层基准，数据量越大越信任自身，数据量越小越信任父层</w:t>
+      </w:r>
+    </w:p>
+    <w:p>
+      <w:r>
+        <w:t>针对问题三（其他年份未利用）：双层加权体系</w:t>
+      </w:r>
+    </w:p>
+    <w:p>
+      <w:pPr>
+        <w:pStyle w:val="ListBullet"/>
+      </w:pPr>
+      <w:r>
+        <w:t>第一层 — 时间衰减加权：同月跨年用 λ_same（0.95）衰减，非同月用 λ（0.80）衰减 + 月份相似度</w:t>
+      </w:r>
+    </w:p>
+    <w:p>
+      <w:pPr>
+        <w:pStyle w:val="ListBullet"/>
+      </w:pPr>
+      <w:r>
+        <w:t>第二层 — 趋势因子：比较去年同期与前年同期的分仓占比差，把趋势方向叠加到最终占比（动态α：≥100单用原始α，50-100单用α/2，&lt;50单跳过）</w:t>
+      </w:r>
+    </w:p>
+    <w:p>
+      <w:pPr>
+        <w:pStyle w:val="ListBullet"/>
+      </w:pPr>
+      <w:r>
+        <w:t>两个维度协同：时间衰减充分利用所有历史数据，趋势因子捕捉年度变化方向</w:t>
+      </w:r>
+    </w:p>
+    <w:p>
+      <w:pPr>
+        <w:pStyle w:val="Heading2"/>
+      </w:pPr>
+      <w:r>
+        <w:t>1.3 核心能力</w:t>
       </w:r>
     </w:p>
     <w:p>
@@ -519,6 +729,14 @@
         <w:pStyle w:val="ListBullet"/>
       </w:pPr>
       <w:r>
+        <w:t>季节性分层检测：品类级自动推荐（分仓偏移量≥阈值）+ SKU级分层回退（SKU→SPU→品类→弱季节）</w:t>
+      </w:r>
+    </w:p>
+    <w:p>
+      <w:pPr>
+        <w:pStyle w:val="ListBullet"/>
+      </w:pPr>
+      <w:r>
         <w:t>减仓优化：月均&lt;3单且占比&lt;5%的仓位自动减仓，占比等比分配到其他仓</w:t>
       </w:r>
     </w:p>
@@ -535,7 +753,7 @@
         <w:pStyle w:val="ListBullet"/>
       </w:pPr>
       <w:r>
-        <w:t>占比微调：拖动滑块调整四仓占比，自动补足到 100%</w:t>
+        <w:t>占比微调：拖动滑块调整四仓占比，自动补足到 100%，支持单SKU和批量微调</w:t>
       </w:r>
     </w:p>
     <w:p>
@@ -543,7 +761,7 @@
         <w:pStyle w:val="ListBullet"/>
       </w:pPr>
       <w:r>
-        <w:t>多维度导出：Excel（含聚合）、CSV（SKU级/一级分类）</w:t>
+        <w:t>多维度导出：Excel（含聚合）、CSV（SKU级/全层级聚合/一级分类）</w:t>
       </w:r>
     </w:p>
     <w:p>

</xml_diff>